<commit_message>
Hogar de Refugio: índice de planos de arquitectura con el plano topográfico PT-01 (108 láminas)
Co-Authored-By: Claude Opus 5.5 <noreply@anthropic.com>
Claude-Session: https://claude.ai/code/session_0142t8T16igb3VKxUPwnQPq6
</commit_message>
<xml_diff>
--- a/entregables/INDICE_DE_PLANOS_ARQUITECTURA_HOGAR_REFUGIO.docx
+++ b/entregables/INDICE_DE_PLANOS_ARQUITECTURA_HOGAR_REFUGIO.docx
@@ -242,7 +242,7 @@
                 <w:color w:val="7B1E2B"/>
                 <w:sz w:val="15"/>
               </w:rPr>
-              <w:t>I.  ARQUITECTURA  (7)</w:t>
+              <w:t>I.  ARQUITECTURA  (8)</w:t>
             </w:r>
           </w:p>
         </w:tc>
@@ -512,7 +512,7 @@
                 <w:color w:val="7B1E2B"/>
                 <w:sz w:val="16"/>
               </w:rPr>
-              <w:t>PZ-01</w:t>
+              <w:t>PT-01</w:t>
             </w:r>
           </w:p>
         </w:tc>
@@ -533,7 +533,7 @@
                 <w:i w:val="0"/>
                 <w:sz w:val="16"/>
               </w:rPr>
-              <w:t>PLANO DE ZONIFICACIÓN</w:t>
+              <w:t>PLANO TOPOGRÁFICO</w:t>
             </w:r>
           </w:p>
         </w:tc>
@@ -623,7 +623,7 @@
                 <w:color w:val="7B1E2B"/>
                 <w:sz w:val="16"/>
               </w:rPr>
-              <w:t>PG-01</w:t>
+              <w:t>PZ-01</w:t>
             </w:r>
           </w:p>
         </w:tc>
@@ -644,7 +644,7 @@
                 <w:i w:val="0"/>
                 <w:sz w:val="16"/>
               </w:rPr>
-              <w:t>PLANTA GENERAL-PRIMER NIVEL</w:t>
+              <w:t>PLANO DE ZONIFICACIÓN</w:t>
             </w:r>
           </w:p>
         </w:tc>
@@ -734,7 +734,7 @@
                 <w:color w:val="7B1E2B"/>
                 <w:sz w:val="16"/>
               </w:rPr>
-              <w:t>PG-02</w:t>
+              <w:t>PG-01</w:t>
             </w:r>
           </w:p>
         </w:tc>
@@ -755,7 +755,7 @@
                 <w:i w:val="0"/>
                 <w:sz w:val="16"/>
               </w:rPr>
-              <w:t>PLANTA GENERAL-TECHOS</w:t>
+              <w:t>PLANTA GENERAL-PRIMER NIVEL</w:t>
             </w:r>
           </w:p>
         </w:tc>
@@ -845,7 +845,7 @@
                 <w:color w:val="7B1E2B"/>
                 <w:sz w:val="16"/>
               </w:rPr>
-              <w:t>CG-01</w:t>
+              <w:t>PG-02</w:t>
             </w:r>
           </w:p>
         </w:tc>
@@ -866,7 +866,7 @@
                 <w:i w:val="0"/>
                 <w:sz w:val="16"/>
               </w:rPr>
-              <w:t>CORTES GENERALES</w:t>
+              <w:t>PLANTA GENERAL-TECHOS</w:t>
             </w:r>
           </w:p>
         </w:tc>
@@ -956,7 +956,7 @@
                 <w:color w:val="7B1E2B"/>
                 <w:sz w:val="16"/>
               </w:rPr>
-              <w:t>EG-01</w:t>
+              <w:t>CG-01</w:t>
             </w:r>
           </w:p>
         </w:tc>
@@ -977,7 +977,7 @@
                 <w:i w:val="0"/>
                 <w:sz w:val="16"/>
               </w:rPr>
-              <w:t>ELEVACIONES GENERALES</w:t>
+              <w:t>CORTES GENERALES</w:t>
             </w:r>
           </w:p>
         </w:tc>
@@ -1030,9 +1030,50 @@
         </w:trPr>
         <w:tc>
           <w:tcPr>
-            <w:tcW w:type="dxa" w:w="9864"/>
-            <w:gridSpan w:val="5"/>
-            <w:shd w:val="clear" w:color="auto" w:fill="F2E6E8"/>
+            <w:tcW w:type="dxa" w:w="567"/>
+            <w:vAlign w:val="center"/>
+          </w:tcPr>
+          <w:p>
+            <w:pPr>
+              <w:spacing w:before="20" w:after="20" w:line="240" w:lineRule="auto"/>
+              <w:jc w:val="center"/>
+            </w:pPr>
+            <w:r>
+              <w:rPr>
+                <w:rFonts w:ascii="Arial" w:hAnsi="Arial" w:eastAsia="Arial"/>
+                <w:b w:val="0"/>
+                <w:i w:val="0"/>
+                <w:sz w:val="16"/>
+              </w:rPr>
+              <w:t>08</w:t>
+            </w:r>
+          </w:p>
+        </w:tc>
+        <w:tc>
+          <w:tcPr>
+            <w:tcW w:type="dxa" w:w="1474"/>
+            <w:vAlign w:val="center"/>
+          </w:tcPr>
+          <w:p>
+            <w:pPr>
+              <w:spacing w:before="20" w:after="20" w:line="240" w:lineRule="auto"/>
+              <w:jc w:val="center"/>
+            </w:pPr>
+            <w:r>
+              <w:rPr>
+                <w:rFonts w:ascii="Arial" w:hAnsi="Arial" w:eastAsia="Arial"/>
+                <w:b/>
+                <w:i w:val="0"/>
+                <w:color w:val="7B1E2B"/>
+                <w:sz w:val="16"/>
+              </w:rPr>
+              <w:t>EG-01</w:t>
+            </w:r>
+          </w:p>
+        </w:tc>
+        <w:tc>
+          <w:tcPr>
+            <w:tcW w:type="dxa" w:w="5953"/>
             <w:vAlign w:val="center"/>
           </w:tcPr>
           <w:p>
@@ -1045,10 +1086,51 @@
                 <w:rFonts w:ascii="Arial" w:hAnsi="Arial" w:eastAsia="Arial"/>
                 <w:b/>
                 <w:i w:val="0"/>
-                <w:color w:val="7B1E2B"/>
-                <w:sz w:val="15"/>
-              </w:rPr>
-              <w:t>II.  DESARROLLO DE MÓDULOS  (34)</w:t>
+                <w:sz w:val="16"/>
+              </w:rPr>
+              <w:t>ELEVACIONES GENERALES</w:t>
+            </w:r>
+          </w:p>
+        </w:tc>
+        <w:tc>
+          <w:tcPr>
+            <w:tcW w:type="dxa" w:w="1077"/>
+            <w:vAlign w:val="center"/>
+          </w:tcPr>
+          <w:p>
+            <w:pPr>
+              <w:spacing w:before="20" w:after="20" w:line="240" w:lineRule="auto"/>
+              <w:jc w:val="center"/>
+            </w:pPr>
+            <w:r>
+              <w:rPr>
+                <w:rFonts w:ascii="Arial" w:hAnsi="Arial" w:eastAsia="Arial"/>
+                <w:b w:val="0"/>
+                <w:i w:val="0"/>
+                <w:sz w:val="16"/>
+              </w:rPr>
+              <w:t>A1</w:t>
+            </w:r>
+          </w:p>
+        </w:tc>
+        <w:tc>
+          <w:tcPr>
+            <w:tcW w:type="dxa" w:w="794"/>
+            <w:vAlign w:val="center"/>
+          </w:tcPr>
+          <w:p>
+            <w:pPr>
+              <w:spacing w:before="20" w:after="20" w:line="240" w:lineRule="auto"/>
+              <w:jc w:val="center"/>
+            </w:pPr>
+            <w:r>
+              <w:rPr>
+                <w:rFonts w:ascii="Arial" w:hAnsi="Arial" w:eastAsia="Arial"/>
+                <w:b w:val="0"/>
+                <w:i w:val="0"/>
+                <w:sz w:val="16"/>
+              </w:rPr>
+              <w:t>1</w:t>
             </w:r>
           </w:p>
         </w:tc>
@@ -1059,34 +1141,15 @@
         </w:trPr>
         <w:tc>
           <w:tcPr>
-            <w:tcW w:type="dxa" w:w="567"/>
-            <w:vAlign w:val="center"/>
-          </w:tcPr>
-          <w:p>
-            <w:pPr>
-              <w:spacing w:before="20" w:after="20" w:line="240" w:lineRule="auto"/>
-              <w:jc w:val="center"/>
-            </w:pPr>
-            <w:r>
-              <w:rPr>
-                <w:rFonts w:ascii="Arial" w:hAnsi="Arial" w:eastAsia="Arial"/>
-                <w:b w:val="0"/>
-                <w:i w:val="0"/>
-                <w:sz w:val="16"/>
-              </w:rPr>
-              <w:t>08</w:t>
-            </w:r>
-          </w:p>
-        </w:tc>
-        <w:tc>
-          <w:tcPr>
-            <w:tcW w:type="dxa" w:w="1474"/>
-            <w:vAlign w:val="center"/>
-          </w:tcPr>
-          <w:p>
-            <w:pPr>
-              <w:spacing w:before="20" w:after="20" w:line="240" w:lineRule="auto"/>
-              <w:jc w:val="center"/>
+            <w:tcW w:type="dxa" w:w="9864"/>
+            <w:gridSpan w:val="5"/>
+            <w:shd w:val="clear" w:color="auto" w:fill="F2E6E8"/>
+            <w:vAlign w:val="center"/>
+          </w:tcPr>
+          <w:p>
+            <w:pPr>
+              <w:spacing w:before="20" w:after="20" w:line="240" w:lineRule="auto"/>
+              <w:jc w:val="left"/>
             </w:pPr>
             <w:r>
               <w:rPr>
@@ -1094,72 +1157,9 @@
                 <w:b/>
                 <w:i w:val="0"/>
                 <w:color w:val="7B1E2B"/>
-                <w:sz w:val="16"/>
-              </w:rPr>
-              <w:t>A-01/01-05</w:t>
-            </w:r>
-          </w:p>
-        </w:tc>
-        <w:tc>
-          <w:tcPr>
-            <w:tcW w:type="dxa" w:w="5953"/>
-            <w:vAlign w:val="center"/>
-          </w:tcPr>
-          <w:p>
-            <w:pPr>
-              <w:spacing w:before="20" w:after="20" w:line="240" w:lineRule="auto"/>
-              <w:jc w:val="left"/>
-            </w:pPr>
-            <w:r>
-              <w:rPr>
-                <w:rFonts w:ascii="Arial" w:hAnsi="Arial" w:eastAsia="Arial"/>
-                <w:b/>
-                <w:i w:val="0"/>
-                <w:sz w:val="16"/>
-              </w:rPr>
-              <w:t>EDIFICACIÓN 01 / 01 - 05</w:t>
-            </w:r>
-          </w:p>
-        </w:tc>
-        <w:tc>
-          <w:tcPr>
-            <w:tcW w:type="dxa" w:w="1077"/>
-            <w:vAlign w:val="center"/>
-          </w:tcPr>
-          <w:p>
-            <w:pPr>
-              <w:spacing w:before="20" w:after="20" w:line="240" w:lineRule="auto"/>
-              <w:jc w:val="center"/>
-            </w:pPr>
-            <w:r>
-              <w:rPr>
-                <w:rFonts w:ascii="Arial" w:hAnsi="Arial" w:eastAsia="Arial"/>
-                <w:b w:val="0"/>
-                <w:i w:val="0"/>
-                <w:sz w:val="16"/>
-              </w:rPr>
-              <w:t>A1</w:t>
-            </w:r>
-          </w:p>
-        </w:tc>
-        <w:tc>
-          <w:tcPr>
-            <w:tcW w:type="dxa" w:w="794"/>
-            <w:vAlign w:val="center"/>
-          </w:tcPr>
-          <w:p>
-            <w:pPr>
-              <w:spacing w:before="20" w:after="20" w:line="240" w:lineRule="auto"/>
-              <w:jc w:val="center"/>
-            </w:pPr>
-            <w:r>
-              <w:rPr>
-                <w:rFonts w:ascii="Arial" w:hAnsi="Arial" w:eastAsia="Arial"/>
-                <w:b w:val="0"/>
-                <w:i w:val="0"/>
-                <w:sz w:val="16"/>
-              </w:rPr>
-              <w:t>1</w:t>
+                <w:sz w:val="15"/>
+              </w:rPr>
+              <w:t>II.  DESARROLLO DE MÓDULOS  (34)</w:t>
             </w:r>
           </w:p>
         </w:tc>
@@ -1207,7 +1207,7 @@
                 <w:color w:val="7B1E2B"/>
                 <w:sz w:val="16"/>
               </w:rPr>
-              <w:t>A-01/02-05</w:t>
+              <w:t>A-01/01-05</w:t>
             </w:r>
           </w:p>
         </w:tc>
@@ -1228,7 +1228,7 @@
                 <w:i w:val="0"/>
                 <w:sz w:val="16"/>
               </w:rPr>
-              <w:t>EDIFICACIÓN 01 / 02 - 05</w:t>
+              <w:t>EDIFICACIÓN 01 / 01 - 05</w:t>
             </w:r>
           </w:p>
         </w:tc>
@@ -1318,7 +1318,7 @@
                 <w:color w:val="7B1E2B"/>
                 <w:sz w:val="16"/>
               </w:rPr>
-              <w:t>A-01/03-05</w:t>
+              <w:t>A-01/02-05</w:t>
             </w:r>
           </w:p>
         </w:tc>
@@ -1339,7 +1339,7 @@
                 <w:i w:val="0"/>
                 <w:sz w:val="16"/>
               </w:rPr>
-              <w:t>EDIFICACIÓN 01 / 03 - 05</w:t>
+              <w:t>EDIFICACIÓN 01 / 02 - 05</w:t>
             </w:r>
           </w:p>
         </w:tc>
@@ -1429,7 +1429,7 @@
                 <w:color w:val="7B1E2B"/>
                 <w:sz w:val="16"/>
               </w:rPr>
-              <w:t>A-01/04-05</w:t>
+              <w:t>A-01/03-05</w:t>
             </w:r>
           </w:p>
         </w:tc>
@@ -1450,7 +1450,7 @@
                 <w:i w:val="0"/>
                 <w:sz w:val="16"/>
               </w:rPr>
-              <w:t>EDIFICACIÓN 01 / 04 - 05</w:t>
+              <w:t>EDIFICACIÓN 01 / 03 - 05</w:t>
             </w:r>
           </w:p>
         </w:tc>
@@ -1540,7 +1540,7 @@
                 <w:color w:val="7B1E2B"/>
                 <w:sz w:val="16"/>
               </w:rPr>
-              <w:t>A-01/05-05</w:t>
+              <w:t>A-01/04-05</w:t>
             </w:r>
           </w:p>
         </w:tc>
@@ -1561,7 +1561,7 @@
                 <w:i w:val="0"/>
                 <w:sz w:val="16"/>
               </w:rPr>
-              <w:t>EDIFICACIÓN 01 / 05 - 05</w:t>
+              <w:t>EDIFICACIÓN 01 / 04 - 05</w:t>
             </w:r>
           </w:p>
         </w:tc>
@@ -1651,7 +1651,7 @@
                 <w:color w:val="7B1E2B"/>
                 <w:sz w:val="16"/>
               </w:rPr>
-              <w:t>A-02/01-03</w:t>
+              <w:t>A-01/05-05</w:t>
             </w:r>
           </w:p>
         </w:tc>
@@ -1672,7 +1672,7 @@
                 <w:i w:val="0"/>
                 <w:sz w:val="16"/>
               </w:rPr>
-              <w:t>EDIFICACIÓN 02 / 01 - 03</w:t>
+              <w:t>EDIFICACIÓN 01 / 05 - 05</w:t>
             </w:r>
           </w:p>
         </w:tc>
@@ -1762,7 +1762,7 @@
                 <w:color w:val="7B1E2B"/>
                 <w:sz w:val="16"/>
               </w:rPr>
-              <w:t>A-02/02-03</w:t>
+              <w:t>A-02/01-03</w:t>
             </w:r>
           </w:p>
         </w:tc>
@@ -1783,7 +1783,7 @@
                 <w:i w:val="0"/>
                 <w:sz w:val="16"/>
               </w:rPr>
-              <w:t>EDIFICACIÓN 02 / 02 - 03</w:t>
+              <w:t>EDIFICACIÓN 02 / 01 - 03</w:t>
             </w:r>
           </w:p>
         </w:tc>
@@ -1873,7 +1873,7 @@
                 <w:color w:val="7B1E2B"/>
                 <w:sz w:val="16"/>
               </w:rPr>
-              <w:t>A-02/03-03</w:t>
+              <w:t>A-02/02-03</w:t>
             </w:r>
           </w:p>
         </w:tc>
@@ -1894,7 +1894,7 @@
                 <w:i w:val="0"/>
                 <w:sz w:val="16"/>
               </w:rPr>
-              <w:t>EDIFICACIÓN 02 / 03 - 03</w:t>
+              <w:t>EDIFICACIÓN 02 / 02 - 03</w:t>
             </w:r>
           </w:p>
         </w:tc>
@@ -1984,7 +1984,7 @@
                 <w:color w:val="7B1E2B"/>
                 <w:sz w:val="16"/>
               </w:rPr>
-              <w:t>A-03/01-03</w:t>
+              <w:t>A-02/03-03</w:t>
             </w:r>
           </w:p>
         </w:tc>
@@ -2005,7 +2005,7 @@
                 <w:i w:val="0"/>
                 <w:sz w:val="16"/>
               </w:rPr>
-              <w:t>EDIFICACIÓN 03 / 01 - 03</w:t>
+              <w:t>EDIFICACIÓN 02 / 03 - 03</w:t>
             </w:r>
           </w:p>
         </w:tc>
@@ -2095,7 +2095,7 @@
                 <w:color w:val="7B1E2B"/>
                 <w:sz w:val="16"/>
               </w:rPr>
-              <w:t>A-03/02-03</w:t>
+              <w:t>A-03/01-03</w:t>
             </w:r>
           </w:p>
         </w:tc>
@@ -2116,7 +2116,7 @@
                 <w:i w:val="0"/>
                 <w:sz w:val="16"/>
               </w:rPr>
-              <w:t>EDIFICACIÓN 03 / 02 - 03</w:t>
+              <w:t>EDIFICACIÓN 03 / 01 - 03</w:t>
             </w:r>
           </w:p>
         </w:tc>
@@ -2206,7 +2206,7 @@
                 <w:color w:val="7B1E2B"/>
                 <w:sz w:val="16"/>
               </w:rPr>
-              <w:t>A-03/03-03</w:t>
+              <w:t>A-03/02-03</w:t>
             </w:r>
           </w:p>
         </w:tc>
@@ -2227,7 +2227,7 @@
                 <w:i w:val="0"/>
                 <w:sz w:val="16"/>
               </w:rPr>
-              <w:t>EDIFICACIÓN 03 / 03 - 03</w:t>
+              <w:t>EDIFICACIÓN 03 / 02 - 03</w:t>
             </w:r>
           </w:p>
         </w:tc>
@@ -2317,7 +2317,7 @@
                 <w:color w:val="7B1E2B"/>
                 <w:sz w:val="16"/>
               </w:rPr>
-              <w:t>A-04/01-04</w:t>
+              <w:t>A-03/03-03</w:t>
             </w:r>
           </w:p>
         </w:tc>
@@ -2338,7 +2338,7 @@
                 <w:i w:val="0"/>
                 <w:sz w:val="16"/>
               </w:rPr>
-              <w:t>EDIFICACIÓN 04 / 01 - 04</w:t>
+              <w:t>EDIFICACIÓN 03 / 03 - 03</w:t>
             </w:r>
           </w:p>
         </w:tc>
@@ -2428,7 +2428,7 @@
                 <w:color w:val="7B1E2B"/>
                 <w:sz w:val="16"/>
               </w:rPr>
-              <w:t>A-04/02-04</w:t>
+              <w:t>A-04/01-04</w:t>
             </w:r>
           </w:p>
         </w:tc>
@@ -2449,7 +2449,7 @@
                 <w:i w:val="0"/>
                 <w:sz w:val="16"/>
               </w:rPr>
-              <w:t>EDIFICACIÓN 04 / 02 - 04</w:t>
+              <w:t>EDIFICACIÓN 04 / 01 - 04</w:t>
             </w:r>
           </w:p>
         </w:tc>
@@ -2539,7 +2539,7 @@
                 <w:color w:val="7B1E2B"/>
                 <w:sz w:val="16"/>
               </w:rPr>
-              <w:t>A-04/03-04</w:t>
+              <w:t>A-04/02-04</w:t>
             </w:r>
           </w:p>
         </w:tc>
@@ -2560,7 +2560,7 @@
                 <w:i w:val="0"/>
                 <w:sz w:val="16"/>
               </w:rPr>
-              <w:t>EDIFICACIÓN 04 / 03 - 04</w:t>
+              <w:t>EDIFICACIÓN 04 / 02 - 04</w:t>
             </w:r>
           </w:p>
         </w:tc>
@@ -2650,7 +2650,7 @@
                 <w:color w:val="7B1E2B"/>
                 <w:sz w:val="16"/>
               </w:rPr>
-              <w:t>A-04/04-04</w:t>
+              <w:t>A-04/03-04</w:t>
             </w:r>
           </w:p>
         </w:tc>
@@ -2671,7 +2671,7 @@
                 <w:i w:val="0"/>
                 <w:sz w:val="16"/>
               </w:rPr>
-              <w:t>EDIFICACIÓN 04 / 04 - 04</w:t>
+              <w:t>EDIFICACIÓN 04 / 03 - 04</w:t>
             </w:r>
           </w:p>
         </w:tc>
@@ -2761,7 +2761,7 @@
                 <w:color w:val="7B1E2B"/>
                 <w:sz w:val="16"/>
               </w:rPr>
-              <w:t>A-05/01-04</w:t>
+              <w:t>A-04/04-04</w:t>
             </w:r>
           </w:p>
         </w:tc>
@@ -2782,7 +2782,7 @@
                 <w:i w:val="0"/>
                 <w:sz w:val="16"/>
               </w:rPr>
-              <w:t>EDIFICACIÓN 05 / 01 - 04</w:t>
+              <w:t>EDIFICACIÓN 04 / 04 - 04</w:t>
             </w:r>
           </w:p>
         </w:tc>
@@ -2872,7 +2872,7 @@
                 <w:color w:val="7B1E2B"/>
                 <w:sz w:val="16"/>
               </w:rPr>
-              <w:t>A-05/02-04</w:t>
+              <w:t>A-05/01-04</w:t>
             </w:r>
           </w:p>
         </w:tc>
@@ -2893,7 +2893,7 @@
                 <w:i w:val="0"/>
                 <w:sz w:val="16"/>
               </w:rPr>
-              <w:t>EDIFICACIÓN 05 / 02 - 04</w:t>
+              <w:t>EDIFICACIÓN 05 / 01 - 04</w:t>
             </w:r>
           </w:p>
         </w:tc>
@@ -2983,7 +2983,7 @@
                 <w:color w:val="7B1E2B"/>
                 <w:sz w:val="16"/>
               </w:rPr>
-              <w:t>A-05/03-04</w:t>
+              <w:t>A-05/02-04</w:t>
             </w:r>
           </w:p>
         </w:tc>
@@ -3004,7 +3004,7 @@
                 <w:i w:val="0"/>
                 <w:sz w:val="16"/>
               </w:rPr>
-              <w:t>EDIFICACIÓN 05 / 03 - 04</w:t>
+              <w:t>EDIFICACIÓN 05 / 02 - 04</w:t>
             </w:r>
           </w:p>
         </w:tc>
@@ -3094,7 +3094,7 @@
                 <w:color w:val="7B1E2B"/>
                 <w:sz w:val="16"/>
               </w:rPr>
-              <w:t>A-05/04-04</w:t>
+              <w:t>A-05/03-04</w:t>
             </w:r>
           </w:p>
         </w:tc>
@@ -3115,7 +3115,7 @@
                 <w:i w:val="0"/>
                 <w:sz w:val="16"/>
               </w:rPr>
-              <w:t>EDIFICACIÓN 05 / 04 - 04</w:t>
+              <w:t>EDIFICACIÓN 05 / 03 - 04</w:t>
             </w:r>
           </w:p>
         </w:tc>
@@ -3205,7 +3205,7 @@
                 <w:color w:val="7B1E2B"/>
                 <w:sz w:val="16"/>
               </w:rPr>
-              <w:t>A-06/01-04</w:t>
+              <w:t>A-05/04-04</w:t>
             </w:r>
           </w:p>
         </w:tc>
@@ -3226,7 +3226,7 @@
                 <w:i w:val="0"/>
                 <w:sz w:val="16"/>
               </w:rPr>
-              <w:t>EDIFICACIÓN 06 / 01 - 04</w:t>
+              <w:t>EDIFICACIÓN 05 / 04 - 04</w:t>
             </w:r>
           </w:p>
         </w:tc>
@@ -3316,7 +3316,7 @@
                 <w:color w:val="7B1E2B"/>
                 <w:sz w:val="16"/>
               </w:rPr>
-              <w:t>A-06/02-04</w:t>
+              <w:t>A-06/01-04</w:t>
             </w:r>
           </w:p>
         </w:tc>
@@ -3337,7 +3337,7 @@
                 <w:i w:val="0"/>
                 <w:sz w:val="16"/>
               </w:rPr>
-              <w:t>EDIFICACIÓN 06 / 02 - 04</w:t>
+              <w:t>EDIFICACIÓN 06 / 01 - 04</w:t>
             </w:r>
           </w:p>
         </w:tc>
@@ -3427,7 +3427,7 @@
                 <w:color w:val="7B1E2B"/>
                 <w:sz w:val="16"/>
               </w:rPr>
-              <w:t>A-06/03-04</w:t>
+              <w:t>A-06/02-04</w:t>
             </w:r>
           </w:p>
         </w:tc>
@@ -3448,7 +3448,7 @@
                 <w:i w:val="0"/>
                 <w:sz w:val="16"/>
               </w:rPr>
-              <w:t>EDIFICACIÓN 06 / 03 - 04</w:t>
+              <w:t>EDIFICACIÓN 06 / 02 - 04</w:t>
             </w:r>
           </w:p>
         </w:tc>
@@ -3538,7 +3538,7 @@
                 <w:color w:val="7B1E2B"/>
                 <w:sz w:val="16"/>
               </w:rPr>
-              <w:t>A-06/04-04</w:t>
+              <w:t>A-06/03-04</w:t>
             </w:r>
           </w:p>
         </w:tc>
@@ -3559,7 +3559,7 @@
                 <w:i w:val="0"/>
                 <w:sz w:val="16"/>
               </w:rPr>
-              <w:t>EDIFICACIÓN 06 / 04 - 04</w:t>
+              <w:t>EDIFICACIÓN 06 / 03 - 04</w:t>
             </w:r>
           </w:p>
         </w:tc>
@@ -3649,7 +3649,7 @@
                 <w:color w:val="7B1E2B"/>
                 <w:sz w:val="16"/>
               </w:rPr>
-              <w:t>A-07/01-04</w:t>
+              <w:t>A-06/04-04</w:t>
             </w:r>
           </w:p>
         </w:tc>
@@ -3670,7 +3670,7 @@
                 <w:i w:val="0"/>
                 <w:sz w:val="16"/>
               </w:rPr>
-              <w:t>EDIFICACIÓN 07 / 01 - 04</w:t>
+              <w:t>EDIFICACIÓN 06 / 04 - 04</w:t>
             </w:r>
           </w:p>
         </w:tc>
@@ -3760,7 +3760,7 @@
                 <w:color w:val="7B1E2B"/>
                 <w:sz w:val="16"/>
               </w:rPr>
-              <w:t>A-07/02-04</w:t>
+              <w:t>A-07/01-04</w:t>
             </w:r>
           </w:p>
         </w:tc>
@@ -3781,7 +3781,7 @@
                 <w:i w:val="0"/>
                 <w:sz w:val="16"/>
               </w:rPr>
-              <w:t>EDIFICACIÓN 07 / 02 - 04</w:t>
+              <w:t>EDIFICACIÓN 07 / 01 - 04</w:t>
             </w:r>
           </w:p>
         </w:tc>
@@ -3871,7 +3871,7 @@
                 <w:color w:val="7B1E2B"/>
                 <w:sz w:val="16"/>
               </w:rPr>
-              <w:t>A-07/03-04</w:t>
+              <w:t>A-07/02-04</w:t>
             </w:r>
           </w:p>
         </w:tc>
@@ -3892,7 +3892,7 @@
                 <w:i w:val="0"/>
                 <w:sz w:val="16"/>
               </w:rPr>
-              <w:t>EDIFICACIÓN 07 / 03 - 04</w:t>
+              <w:t>EDIFICACIÓN 07 / 02 - 04</w:t>
             </w:r>
           </w:p>
         </w:tc>
@@ -3982,7 +3982,7 @@
                 <w:color w:val="7B1E2B"/>
                 <w:sz w:val="16"/>
               </w:rPr>
-              <w:t>A-07/04-04</w:t>
+              <w:t>A-07/03-04</w:t>
             </w:r>
           </w:p>
         </w:tc>
@@ -4003,7 +4003,7 @@
                 <w:i w:val="0"/>
                 <w:sz w:val="16"/>
               </w:rPr>
-              <w:t>EDIFICACIÓN 07 / 04 - 04</w:t>
+              <w:t>EDIFICACIÓN 07 / 03 - 04</w:t>
             </w:r>
           </w:p>
         </w:tc>
@@ -4093,7 +4093,7 @@
                 <w:color w:val="7B1E2B"/>
                 <w:sz w:val="16"/>
               </w:rPr>
-              <w:t>A-08/01-04</w:t>
+              <w:t>A-07/04-04</w:t>
             </w:r>
           </w:p>
         </w:tc>
@@ -4114,7 +4114,7 @@
                 <w:i w:val="0"/>
                 <w:sz w:val="16"/>
               </w:rPr>
-              <w:t>EDIFICACIÓN 08 / 01 - 04</w:t>
+              <w:t>EDIFICACIÓN 07 / 04 - 04</w:t>
             </w:r>
           </w:p>
         </w:tc>
@@ -4204,7 +4204,7 @@
                 <w:color w:val="7B1E2B"/>
                 <w:sz w:val="16"/>
               </w:rPr>
-              <w:t>A-08/02-04</w:t>
+              <w:t>A-08/01-04</w:t>
             </w:r>
           </w:p>
         </w:tc>
@@ -4225,7 +4225,7 @@
                 <w:i w:val="0"/>
                 <w:sz w:val="16"/>
               </w:rPr>
-              <w:t>EDIFICACIÓN 08 / 02 - 04</w:t>
+              <w:t>EDIFICACIÓN 08 / 01 - 04</w:t>
             </w:r>
           </w:p>
         </w:tc>
@@ -4315,7 +4315,7 @@
                 <w:color w:val="7B1E2B"/>
                 <w:sz w:val="16"/>
               </w:rPr>
-              <w:t>A-08/03-04</w:t>
+              <w:t>A-08/02-04</w:t>
             </w:r>
           </w:p>
         </w:tc>
@@ -4336,7 +4336,7 @@
                 <w:i w:val="0"/>
                 <w:sz w:val="16"/>
               </w:rPr>
-              <w:t>EDIFICACIÓN 08 / 03 - 04</w:t>
+              <w:t>EDIFICACIÓN 08 / 02 - 04</w:t>
             </w:r>
           </w:p>
         </w:tc>
@@ -4426,7 +4426,7 @@
                 <w:color w:val="7B1E2B"/>
                 <w:sz w:val="16"/>
               </w:rPr>
-              <w:t>A-08/04-04</w:t>
+              <w:t>A-08/03-04</w:t>
             </w:r>
           </w:p>
         </w:tc>
@@ -4447,7 +4447,7 @@
                 <w:i w:val="0"/>
                 <w:sz w:val="16"/>
               </w:rPr>
-              <w:t>EDIFICACIÓN 08 / 04 - 04</w:t>
+              <w:t>EDIFICACIÓN 08 / 03 - 04</w:t>
             </w:r>
           </w:p>
         </w:tc>
@@ -4537,7 +4537,7 @@
                 <w:color w:val="7B1E2B"/>
                 <w:sz w:val="16"/>
               </w:rPr>
-              <w:t>A-09/01-03</w:t>
+              <w:t>A-08/04-04</w:t>
             </w:r>
           </w:p>
         </w:tc>
@@ -4558,7 +4558,7 @@
                 <w:i w:val="0"/>
                 <w:sz w:val="16"/>
               </w:rPr>
-              <w:t>EDIFICACIÓN 09 / 01 - 03</w:t>
+              <w:t>EDIFICACIÓN 08 / 04 - 04</w:t>
             </w:r>
           </w:p>
         </w:tc>
@@ -4648,7 +4648,7 @@
                 <w:color w:val="7B1E2B"/>
                 <w:sz w:val="16"/>
               </w:rPr>
-              <w:t>A-09/02-03</w:t>
+              <w:t>A-09/01-03</w:t>
             </w:r>
           </w:p>
         </w:tc>
@@ -4669,7 +4669,7 @@
                 <w:i w:val="0"/>
                 <w:sz w:val="16"/>
               </w:rPr>
-              <w:t>EDIFICACIÓN 09 / 02 - 03</w:t>
+              <w:t>EDIFICACIÓN 09 / 01 - 03</w:t>
             </w:r>
           </w:p>
         </w:tc>
@@ -4759,7 +4759,7 @@
                 <w:color w:val="7B1E2B"/>
                 <w:sz w:val="16"/>
               </w:rPr>
-              <w:t>A-09/03-03</w:t>
+              <w:t>A-09/02-03</w:t>
             </w:r>
           </w:p>
         </w:tc>
@@ -4780,7 +4780,7 @@
                 <w:i w:val="0"/>
                 <w:sz w:val="16"/>
               </w:rPr>
-              <w:t>EDIFICACIÓN 09 / 03 - 03</w:t>
+              <w:t>EDIFICACIÓN 09 / 02 - 03</w:t>
             </w:r>
           </w:p>
         </w:tc>
@@ -4833,9 +4833,50 @@
         </w:trPr>
         <w:tc>
           <w:tcPr>
-            <w:tcW w:type="dxa" w:w="9864"/>
-            <w:gridSpan w:val="5"/>
-            <w:shd w:val="clear" w:color="auto" w:fill="F2E6E8"/>
+            <w:tcW w:type="dxa" w:w="567"/>
+            <w:vAlign w:val="center"/>
+          </w:tcPr>
+          <w:p>
+            <w:pPr>
+              <w:spacing w:before="20" w:after="20" w:line="240" w:lineRule="auto"/>
+              <w:jc w:val="center"/>
+            </w:pPr>
+            <w:r>
+              <w:rPr>
+                <w:rFonts w:ascii="Arial" w:hAnsi="Arial" w:eastAsia="Arial"/>
+                <w:b w:val="0"/>
+                <w:i w:val="0"/>
+                <w:sz w:val="16"/>
+              </w:rPr>
+              <w:t>42</w:t>
+            </w:r>
+          </w:p>
+        </w:tc>
+        <w:tc>
+          <w:tcPr>
+            <w:tcW w:type="dxa" w:w="1474"/>
+            <w:vAlign w:val="center"/>
+          </w:tcPr>
+          <w:p>
+            <w:pPr>
+              <w:spacing w:before="20" w:after="20" w:line="240" w:lineRule="auto"/>
+              <w:jc w:val="center"/>
+            </w:pPr>
+            <w:r>
+              <w:rPr>
+                <w:rFonts w:ascii="Arial" w:hAnsi="Arial" w:eastAsia="Arial"/>
+                <w:b/>
+                <w:i w:val="0"/>
+                <w:color w:val="7B1E2B"/>
+                <w:sz w:val="16"/>
+              </w:rPr>
+              <w:t>A-09/03-03</w:t>
+            </w:r>
+          </w:p>
+        </w:tc>
+        <w:tc>
+          <w:tcPr>
+            <w:tcW w:type="dxa" w:w="5953"/>
             <w:vAlign w:val="center"/>
           </w:tcPr>
           <w:p>
@@ -4848,10 +4889,51 @@
                 <w:rFonts w:ascii="Arial" w:hAnsi="Arial" w:eastAsia="Arial"/>
                 <w:b/>
                 <w:i w:val="0"/>
-                <w:color w:val="7B1E2B"/>
-                <w:sz w:val="15"/>
-              </w:rPr>
-              <w:t>III.  OBRAS COMPLEMENTARIAS  (15)</w:t>
+                <w:sz w:val="16"/>
+              </w:rPr>
+              <w:t>EDIFICACIÓN 09 / 03 - 03</w:t>
+            </w:r>
+          </w:p>
+        </w:tc>
+        <w:tc>
+          <w:tcPr>
+            <w:tcW w:type="dxa" w:w="1077"/>
+            <w:vAlign w:val="center"/>
+          </w:tcPr>
+          <w:p>
+            <w:pPr>
+              <w:spacing w:before="20" w:after="20" w:line="240" w:lineRule="auto"/>
+              <w:jc w:val="center"/>
+            </w:pPr>
+            <w:r>
+              <w:rPr>
+                <w:rFonts w:ascii="Arial" w:hAnsi="Arial" w:eastAsia="Arial"/>
+                <w:b w:val="0"/>
+                <w:i w:val="0"/>
+                <w:sz w:val="16"/>
+              </w:rPr>
+              <w:t>A1</w:t>
+            </w:r>
+          </w:p>
+        </w:tc>
+        <w:tc>
+          <w:tcPr>
+            <w:tcW w:type="dxa" w:w="794"/>
+            <w:vAlign w:val="center"/>
+          </w:tcPr>
+          <w:p>
+            <w:pPr>
+              <w:spacing w:before="20" w:after="20" w:line="240" w:lineRule="auto"/>
+              <w:jc w:val="center"/>
+            </w:pPr>
+            <w:r>
+              <w:rPr>
+                <w:rFonts w:ascii="Arial" w:hAnsi="Arial" w:eastAsia="Arial"/>
+                <w:b w:val="0"/>
+                <w:i w:val="0"/>
+                <w:sz w:val="16"/>
+              </w:rPr>
+              <w:t>1</w:t>
             </w:r>
           </w:p>
         </w:tc>
@@ -4862,34 +4944,15 @@
         </w:trPr>
         <w:tc>
           <w:tcPr>
-            <w:tcW w:type="dxa" w:w="567"/>
-            <w:vAlign w:val="center"/>
-          </w:tcPr>
-          <w:p>
-            <w:pPr>
-              <w:spacing w:before="20" w:after="20" w:line="240" w:lineRule="auto"/>
-              <w:jc w:val="center"/>
-            </w:pPr>
-            <w:r>
-              <w:rPr>
-                <w:rFonts w:ascii="Arial" w:hAnsi="Arial" w:eastAsia="Arial"/>
-                <w:b w:val="0"/>
-                <w:i w:val="0"/>
-                <w:sz w:val="16"/>
-              </w:rPr>
-              <w:t>42</w:t>
-            </w:r>
-          </w:p>
-        </w:tc>
-        <w:tc>
-          <w:tcPr>
-            <w:tcW w:type="dxa" w:w="1474"/>
-            <w:vAlign w:val="center"/>
-          </w:tcPr>
-          <w:p>
-            <w:pPr>
-              <w:spacing w:before="20" w:after="20" w:line="240" w:lineRule="auto"/>
-              <w:jc w:val="center"/>
+            <w:tcW w:type="dxa" w:w="9864"/>
+            <w:gridSpan w:val="5"/>
+            <w:shd w:val="clear" w:color="auto" w:fill="F2E6E8"/>
+            <w:vAlign w:val="center"/>
+          </w:tcPr>
+          <w:p>
+            <w:pPr>
+              <w:spacing w:before="20" w:after="20" w:line="240" w:lineRule="auto"/>
+              <w:jc w:val="left"/>
             </w:pPr>
             <w:r>
               <w:rPr>
@@ -4897,72 +4960,9 @@
                 <w:b/>
                 <w:i w:val="0"/>
                 <w:color w:val="7B1E2B"/>
-                <w:sz w:val="16"/>
-              </w:rPr>
-              <w:t>OC-01/01</w:t>
-            </w:r>
-          </w:p>
-        </w:tc>
-        <w:tc>
-          <w:tcPr>
-            <w:tcW w:type="dxa" w:w="5953"/>
-            <w:vAlign w:val="center"/>
-          </w:tcPr>
-          <w:p>
-            <w:pPr>
-              <w:spacing w:before="20" w:after="20" w:line="240" w:lineRule="auto"/>
-              <w:jc w:val="left"/>
-            </w:pPr>
-            <w:r>
-              <w:rPr>
-                <w:rFonts w:ascii="Arial" w:hAnsi="Arial" w:eastAsia="Arial"/>
-                <w:b/>
-                <w:i w:val="0"/>
-                <w:sz w:val="16"/>
-              </w:rPr>
-              <w:t>OC-01-BANCA CON PÉRGOLA</w:t>
-            </w:r>
-          </w:p>
-        </w:tc>
-        <w:tc>
-          <w:tcPr>
-            <w:tcW w:type="dxa" w:w="1077"/>
-            <w:vAlign w:val="center"/>
-          </w:tcPr>
-          <w:p>
-            <w:pPr>
-              <w:spacing w:before="20" w:after="20" w:line="240" w:lineRule="auto"/>
-              <w:jc w:val="center"/>
-            </w:pPr>
-            <w:r>
-              <w:rPr>
-                <w:rFonts w:ascii="Arial" w:hAnsi="Arial" w:eastAsia="Arial"/>
-                <w:b w:val="0"/>
-                <w:i w:val="0"/>
-                <w:sz w:val="16"/>
-              </w:rPr>
-              <w:t>—</w:t>
-            </w:r>
-          </w:p>
-        </w:tc>
-        <w:tc>
-          <w:tcPr>
-            <w:tcW w:type="dxa" w:w="794"/>
-            <w:vAlign w:val="center"/>
-          </w:tcPr>
-          <w:p>
-            <w:pPr>
-              <w:spacing w:before="20" w:after="20" w:line="240" w:lineRule="auto"/>
-              <w:jc w:val="center"/>
-            </w:pPr>
-            <w:r>
-              <w:rPr>
-                <w:rFonts w:ascii="Arial" w:hAnsi="Arial" w:eastAsia="Arial"/>
-                <w:b w:val="0"/>
-                <w:i w:val="0"/>
-                <w:sz w:val="16"/>
-              </w:rPr>
-              <w:t>1</w:t>
+                <w:sz w:val="15"/>
+              </w:rPr>
+              <w:t>III.  OBRAS COMPLEMENTARIAS  (15)</w:t>
             </w:r>
           </w:p>
         </w:tc>
@@ -5010,7 +5010,7 @@
                 <w:color w:val="7B1E2B"/>
                 <w:sz w:val="16"/>
               </w:rPr>
-              <w:t>OC-02/02</w:t>
+              <w:t>OC-01/01</w:t>
             </w:r>
           </w:p>
         </w:tc>
@@ -5031,7 +5031,7 @@
                 <w:i w:val="0"/>
                 <w:sz w:val="16"/>
               </w:rPr>
-              <w:t>OC-02-BASURERO ECOLÓGICO</w:t>
+              <w:t>OC-01-BANCA CON PÉRGOLA</w:t>
             </w:r>
           </w:p>
         </w:tc>
@@ -5121,7 +5121,7 @@
                 <w:color w:val="7B1E2B"/>
                 <w:sz w:val="16"/>
               </w:rPr>
-              <w:t>OC-03/01-03</w:t>
+              <w:t>OC-02/02</w:t>
             </w:r>
           </w:p>
         </w:tc>
@@ -5142,7 +5142,7 @@
                 <w:i w:val="0"/>
                 <w:sz w:val="16"/>
               </w:rPr>
-              <w:t>OC-03-PATIO CÍVICO+ASTA DE BANDERA/01-03</w:t>
+              <w:t>OC-02-BASURERO ECOLÓGICO</w:t>
             </w:r>
           </w:p>
         </w:tc>
@@ -5232,7 +5232,7 @@
                 <w:color w:val="7B1E2B"/>
                 <w:sz w:val="16"/>
               </w:rPr>
-              <w:t>OC-03/02-03</w:t>
+              <w:t>OC-03/01-03</w:t>
             </w:r>
           </w:p>
         </w:tc>
@@ -5253,7 +5253,7 @@
                 <w:i w:val="0"/>
                 <w:sz w:val="16"/>
               </w:rPr>
-              <w:t>OC-03-PATIO CÍVICO+ASTA DE BANDERA/02-03</w:t>
+              <w:t>OC-03-PATIO CÍVICO+ASTA DE BANDERA/01-03</w:t>
             </w:r>
           </w:p>
         </w:tc>
@@ -5343,7 +5343,7 @@
                 <w:color w:val="7B1E2B"/>
                 <w:sz w:val="16"/>
               </w:rPr>
-              <w:t>OC-03/03-03</w:t>
+              <w:t>OC-03/02-03</w:t>
             </w:r>
           </w:p>
         </w:tc>
@@ -5364,7 +5364,7 @@
                 <w:i w:val="0"/>
                 <w:sz w:val="16"/>
               </w:rPr>
-              <w:t>OC-03-PATIO CÍVICO+ASTA DE BANDERA/03-03</w:t>
+              <w:t>OC-03-PATIO CÍVICO+ASTA DE BANDERA/02-03</w:t>
             </w:r>
           </w:p>
         </w:tc>
@@ -5454,7 +5454,7 @@
                 <w:color w:val="7B1E2B"/>
                 <w:sz w:val="16"/>
               </w:rPr>
-              <w:t>OC-04/01-03</w:t>
+              <w:t>OC-03/03-03</w:t>
             </w:r>
           </w:p>
         </w:tc>
@@ -5475,7 +5475,7 @@
                 <w:i w:val="0"/>
                 <w:sz w:val="16"/>
               </w:rPr>
-              <w:t>OC-04-PATIO DE JUEGOS/ 01-03</w:t>
+              <w:t>OC-03-PATIO CÍVICO+ASTA DE BANDERA/03-03</w:t>
             </w:r>
           </w:p>
         </w:tc>
@@ -5565,7 +5565,7 @@
                 <w:color w:val="7B1E2B"/>
                 <w:sz w:val="16"/>
               </w:rPr>
-              <w:t>OC-04/02-03</w:t>
+              <w:t>OC-04/01-03</w:t>
             </w:r>
           </w:p>
         </w:tc>
@@ -5586,7 +5586,7 @@
                 <w:i w:val="0"/>
                 <w:sz w:val="16"/>
               </w:rPr>
-              <w:t>OC-04-PATIO DE JUEGOS /02-03</w:t>
+              <w:t>OC-04-PATIO DE JUEGOS/01-03</w:t>
             </w:r>
           </w:p>
         </w:tc>
@@ -5676,7 +5676,7 @@
                 <w:color w:val="7B1E2B"/>
                 <w:sz w:val="16"/>
               </w:rPr>
-              <w:t>OC-04/03-03</w:t>
+              <w:t>OC-04/02-03</w:t>
             </w:r>
           </w:p>
         </w:tc>
@@ -5697,7 +5697,7 @@
                 <w:i w:val="0"/>
                 <w:sz w:val="16"/>
               </w:rPr>
-              <w:t>OC-04-PATIO DE JUEGOS/03-03</w:t>
+              <w:t>OC-04-PATIO DE JUEGOS/02-03</w:t>
             </w:r>
           </w:p>
         </w:tc>
@@ -5787,7 +5787,7 @@
                 <w:color w:val="7B1E2B"/>
                 <w:sz w:val="16"/>
               </w:rPr>
-              <w:t>OC-05/01-02</w:t>
+              <w:t>OC-04/03-03</w:t>
             </w:r>
           </w:p>
         </w:tc>
@@ -5808,7 +5808,7 @@
                 <w:i w:val="0"/>
                 <w:sz w:val="16"/>
               </w:rPr>
-              <w:t>OC-05-BIOHUERTO/01-02</w:t>
+              <w:t>OC-04-PATIO DE JUEGOS/03-03</w:t>
             </w:r>
           </w:p>
         </w:tc>
@@ -5898,7 +5898,7 @@
                 <w:color w:val="7B1E2B"/>
                 <w:sz w:val="16"/>
               </w:rPr>
-              <w:t>OC-05/02-02</w:t>
+              <w:t>OC-05/01-02</w:t>
             </w:r>
           </w:p>
         </w:tc>
@@ -5919,7 +5919,7 @@
                 <w:i w:val="0"/>
                 <w:sz w:val="16"/>
               </w:rPr>
-              <w:t>OC-05-BIOHUERTO/02-02</w:t>
+              <w:t>OC-05-BIOHUERTO/01-02</w:t>
             </w:r>
           </w:p>
         </w:tc>
@@ -6009,7 +6009,7 @@
                 <w:color w:val="7B1E2B"/>
                 <w:sz w:val="16"/>
               </w:rPr>
-              <w:t>OC-06/01-05</w:t>
+              <w:t>OC-05/02-02</w:t>
             </w:r>
           </w:p>
         </w:tc>
@@ -6030,7 +6030,7 @@
                 <w:i w:val="0"/>
                 <w:sz w:val="16"/>
               </w:rPr>
-              <w:t>OC-06-LOSA DEPORTIVA /01-05</w:t>
+              <w:t>OC-05-BIOHUERTO/02-02</w:t>
             </w:r>
           </w:p>
         </w:tc>
@@ -6120,7 +6120,7 @@
                 <w:color w:val="7B1E2B"/>
                 <w:sz w:val="16"/>
               </w:rPr>
-              <w:t>OC-06/02-05</w:t>
+              <w:t>OC-06/01-05</w:t>
             </w:r>
           </w:p>
         </w:tc>
@@ -6141,7 +6141,7 @@
                 <w:i w:val="0"/>
                 <w:sz w:val="16"/>
               </w:rPr>
-              <w:t>OC-06-LOSA DEPORTIVA /02-05</w:t>
+              <w:t>OC-06-LOSA DEPORTIVA/01-05</w:t>
             </w:r>
           </w:p>
         </w:tc>
@@ -6231,7 +6231,7 @@
                 <w:color w:val="7B1E2B"/>
                 <w:sz w:val="16"/>
               </w:rPr>
-              <w:t>OC-06/03-05</w:t>
+              <w:t>OC-06/02-05</w:t>
             </w:r>
           </w:p>
         </w:tc>
@@ -6252,7 +6252,7 @@
                 <w:i w:val="0"/>
                 <w:sz w:val="16"/>
               </w:rPr>
-              <w:t>OC-06-LOSA DEPORTIVA /03-05</w:t>
+              <w:t>OC-06-LOSA DEPORTIVA/02-05</w:t>
             </w:r>
           </w:p>
         </w:tc>
@@ -6342,7 +6342,7 @@
                 <w:color w:val="7B1E2B"/>
                 <w:sz w:val="16"/>
               </w:rPr>
-              <w:t>OC-06/04-05</w:t>
+              <w:t>OC-06/03-05</w:t>
             </w:r>
           </w:p>
         </w:tc>
@@ -6363,7 +6363,7 @@
                 <w:i w:val="0"/>
                 <w:sz w:val="16"/>
               </w:rPr>
-              <w:t>OC-06-LOSA DEPORTIVA /04-05</w:t>
+              <w:t>OC-06-LOSA DEPORTIVA/03-05</w:t>
             </w:r>
           </w:p>
         </w:tc>
@@ -6453,7 +6453,7 @@
                 <w:color w:val="7B1E2B"/>
                 <w:sz w:val="16"/>
               </w:rPr>
-              <w:t>OC-06/05-05</w:t>
+              <w:t>OC-06/04-05</w:t>
             </w:r>
           </w:p>
         </w:tc>
@@ -6474,7 +6474,7 @@
                 <w:i w:val="0"/>
                 <w:sz w:val="16"/>
               </w:rPr>
-              <w:t>OC-06-LOSA DEPORTIVA /05-05</w:t>
+              <w:t>OC-06-LOSA DEPORTIVA/04-05</w:t>
             </w:r>
           </w:p>
         </w:tc>
@@ -6527,9 +6527,50 @@
         </w:trPr>
         <w:tc>
           <w:tcPr>
-            <w:tcW w:type="dxa" w:w="9864"/>
-            <w:gridSpan w:val="5"/>
-            <w:shd w:val="clear" w:color="auto" w:fill="F2E6E8"/>
+            <w:tcW w:type="dxa" w:w="567"/>
+            <w:vAlign w:val="center"/>
+          </w:tcPr>
+          <w:p>
+            <w:pPr>
+              <w:spacing w:before="20" w:after="20" w:line="240" w:lineRule="auto"/>
+              <w:jc w:val="center"/>
+            </w:pPr>
+            <w:r>
+              <w:rPr>
+                <w:rFonts w:ascii="Arial" w:hAnsi="Arial" w:eastAsia="Arial"/>
+                <w:b w:val="0"/>
+                <w:i w:val="0"/>
+                <w:sz w:val="16"/>
+              </w:rPr>
+              <w:t>57</w:t>
+            </w:r>
+          </w:p>
+        </w:tc>
+        <w:tc>
+          <w:tcPr>
+            <w:tcW w:type="dxa" w:w="1474"/>
+            <w:vAlign w:val="center"/>
+          </w:tcPr>
+          <w:p>
+            <w:pPr>
+              <w:spacing w:before="20" w:after="20" w:line="240" w:lineRule="auto"/>
+              <w:jc w:val="center"/>
+            </w:pPr>
+            <w:r>
+              <w:rPr>
+                <w:rFonts w:ascii="Arial" w:hAnsi="Arial" w:eastAsia="Arial"/>
+                <w:b/>
+                <w:i w:val="0"/>
+                <w:color w:val="7B1E2B"/>
+                <w:sz w:val="16"/>
+              </w:rPr>
+              <w:t>OC-06/05-05</w:t>
+            </w:r>
+          </w:p>
+        </w:tc>
+        <w:tc>
+          <w:tcPr>
+            <w:tcW w:type="dxa" w:w="5953"/>
             <w:vAlign w:val="center"/>
           </w:tcPr>
           <w:p>
@@ -6542,10 +6583,51 @@
                 <w:rFonts w:ascii="Arial" w:hAnsi="Arial" w:eastAsia="Arial"/>
                 <w:b/>
                 <w:i w:val="0"/>
-                <w:color w:val="7B1E2B"/>
-                <w:sz w:val="15"/>
-              </w:rPr>
-              <w:t>IV.  OBRAS EXTERIORES  (12)</w:t>
+                <w:sz w:val="16"/>
+              </w:rPr>
+              <w:t>OC-06-LOSA DEPORTIVA/05-05</w:t>
+            </w:r>
+          </w:p>
+        </w:tc>
+        <w:tc>
+          <w:tcPr>
+            <w:tcW w:type="dxa" w:w="1077"/>
+            <w:vAlign w:val="center"/>
+          </w:tcPr>
+          <w:p>
+            <w:pPr>
+              <w:spacing w:before="20" w:after="20" w:line="240" w:lineRule="auto"/>
+              <w:jc w:val="center"/>
+            </w:pPr>
+            <w:r>
+              <w:rPr>
+                <w:rFonts w:ascii="Arial" w:hAnsi="Arial" w:eastAsia="Arial"/>
+                <w:b w:val="0"/>
+                <w:i w:val="0"/>
+                <w:sz w:val="16"/>
+              </w:rPr>
+              <w:t>—</w:t>
+            </w:r>
+          </w:p>
+        </w:tc>
+        <w:tc>
+          <w:tcPr>
+            <w:tcW w:type="dxa" w:w="794"/>
+            <w:vAlign w:val="center"/>
+          </w:tcPr>
+          <w:p>
+            <w:pPr>
+              <w:spacing w:before="20" w:after="20" w:line="240" w:lineRule="auto"/>
+              <w:jc w:val="center"/>
+            </w:pPr>
+            <w:r>
+              <w:rPr>
+                <w:rFonts w:ascii="Arial" w:hAnsi="Arial" w:eastAsia="Arial"/>
+                <w:b w:val="0"/>
+                <w:i w:val="0"/>
+                <w:sz w:val="16"/>
+              </w:rPr>
+              <w:t>1</w:t>
             </w:r>
           </w:p>
         </w:tc>
@@ -6556,34 +6638,15 @@
         </w:trPr>
         <w:tc>
           <w:tcPr>
-            <w:tcW w:type="dxa" w:w="567"/>
-            <w:vAlign w:val="center"/>
-          </w:tcPr>
-          <w:p>
-            <w:pPr>
-              <w:spacing w:before="20" w:after="20" w:line="240" w:lineRule="auto"/>
-              <w:jc w:val="center"/>
-            </w:pPr>
-            <w:r>
-              <w:rPr>
-                <w:rFonts w:ascii="Arial" w:hAnsi="Arial" w:eastAsia="Arial"/>
-                <w:b w:val="0"/>
-                <w:i w:val="0"/>
-                <w:sz w:val="16"/>
-              </w:rPr>
-              <w:t>57</w:t>
-            </w:r>
-          </w:p>
-        </w:tc>
-        <w:tc>
-          <w:tcPr>
-            <w:tcW w:type="dxa" w:w="1474"/>
-            <w:vAlign w:val="center"/>
-          </w:tcPr>
-          <w:p>
-            <w:pPr>
-              <w:spacing w:before="20" w:after="20" w:line="240" w:lineRule="auto"/>
-              <w:jc w:val="center"/>
+            <w:tcW w:type="dxa" w:w="9864"/>
+            <w:gridSpan w:val="5"/>
+            <w:shd w:val="clear" w:color="auto" w:fill="F2E6E8"/>
+            <w:vAlign w:val="center"/>
+          </w:tcPr>
+          <w:p>
+            <w:pPr>
+              <w:spacing w:before="20" w:after="20" w:line="240" w:lineRule="auto"/>
+              <w:jc w:val="left"/>
             </w:pPr>
             <w:r>
               <w:rPr>
@@ -6591,72 +6654,9 @@
                 <w:b/>
                 <w:i w:val="0"/>
                 <w:color w:val="7B1E2B"/>
-                <w:sz w:val="16"/>
-              </w:rPr>
-              <w:t>OE-01/01-02</w:t>
-            </w:r>
-          </w:p>
-        </w:tc>
-        <w:tc>
-          <w:tcPr>
-            <w:tcW w:type="dxa" w:w="5953"/>
-            <w:vAlign w:val="center"/>
-          </w:tcPr>
-          <w:p>
-            <w:pPr>
-              <w:spacing w:before="20" w:after="20" w:line="240" w:lineRule="auto"/>
-              <w:jc w:val="left"/>
-            </w:pPr>
-            <w:r>
-              <w:rPr>
-                <w:rFonts w:ascii="Arial" w:hAnsi="Arial" w:eastAsia="Arial"/>
-                <w:b/>
-                <w:i w:val="0"/>
-                <w:sz w:val="16"/>
-              </w:rPr>
-              <w:t>OE-01 / 01-02 (INGRESO+CASETA DE VIGILANCIA)</w:t>
-            </w:r>
-          </w:p>
-        </w:tc>
-        <w:tc>
-          <w:tcPr>
-            <w:tcW w:type="dxa" w:w="1077"/>
-            <w:vAlign w:val="center"/>
-          </w:tcPr>
-          <w:p>
-            <w:pPr>
-              <w:spacing w:before="20" w:after="20" w:line="240" w:lineRule="auto"/>
-              <w:jc w:val="center"/>
-            </w:pPr>
-            <w:r>
-              <w:rPr>
-                <w:rFonts w:ascii="Arial" w:hAnsi="Arial" w:eastAsia="Arial"/>
-                <w:b w:val="0"/>
-                <w:i w:val="0"/>
-                <w:sz w:val="16"/>
-              </w:rPr>
-              <w:t>—</w:t>
-            </w:r>
-          </w:p>
-        </w:tc>
-        <w:tc>
-          <w:tcPr>
-            <w:tcW w:type="dxa" w:w="794"/>
-            <w:vAlign w:val="center"/>
-          </w:tcPr>
-          <w:p>
-            <w:pPr>
-              <w:spacing w:before="20" w:after="20" w:line="240" w:lineRule="auto"/>
-              <w:jc w:val="center"/>
-            </w:pPr>
-            <w:r>
-              <w:rPr>
-                <w:rFonts w:ascii="Arial" w:hAnsi="Arial" w:eastAsia="Arial"/>
-                <w:b w:val="0"/>
-                <w:i w:val="0"/>
-                <w:sz w:val="16"/>
-              </w:rPr>
-              <w:t>1</w:t>
+                <w:sz w:val="15"/>
+              </w:rPr>
+              <w:t>IV.  OBRAS EXTERIORES  (12)</w:t>
             </w:r>
           </w:p>
         </w:tc>
@@ -6704,7 +6704,7 @@
                 <w:color w:val="7B1E2B"/>
                 <w:sz w:val="16"/>
               </w:rPr>
-              <w:t>OE-01/02-02</w:t>
+              <w:t>OE-01/01-02</w:t>
             </w:r>
           </w:p>
         </w:tc>
@@ -6725,7 +6725,7 @@
                 <w:i w:val="0"/>
                 <w:sz w:val="16"/>
               </w:rPr>
-              <w:t>OE-01 / 02-02 (INGRESO+CASETA DE VIGILANCIA)</w:t>
+              <w:t>OE-01/01-02 (INGRESO+CASETA DE VIGILANCIA)</w:t>
             </w:r>
           </w:p>
         </w:tc>
@@ -6815,7 +6815,7 @@
                 <w:color w:val="7B1E2B"/>
                 <w:sz w:val="16"/>
               </w:rPr>
-              <w:t>OE-02/01</w:t>
+              <w:t>OE-01/02-02</w:t>
             </w:r>
           </w:p>
         </w:tc>
@@ -6836,7 +6836,7 @@
                 <w:i w:val="0"/>
                 <w:sz w:val="16"/>
               </w:rPr>
-              <w:t>OE-02 / 01-01 (ESTACIONAMIENTO DE MOTOS)</w:t>
+              <w:t>OE-01/02-02 (INGRESO+CASETA DE VIGILANCIA)</w:t>
             </w:r>
           </w:p>
         </w:tc>
@@ -6926,7 +6926,7 @@
                 <w:color w:val="7B1E2B"/>
                 <w:sz w:val="16"/>
               </w:rPr>
-              <w:t>OE-03/01-02</w:t>
+              <w:t>OE-02/01</w:t>
             </w:r>
           </w:p>
         </w:tc>
@@ -6947,7 +6947,7 @@
                 <w:i w:val="0"/>
                 <w:sz w:val="16"/>
               </w:rPr>
-              <w:t>OE-03 / 01-02 (ESTACIONAMIENTO DE AUTOS)</w:t>
+              <w:t>OE-02/01-01 (ESTACIONAMIENTO DE MOTOS)</w:t>
             </w:r>
           </w:p>
         </w:tc>
@@ -7037,7 +7037,7 @@
                 <w:color w:val="7B1E2B"/>
                 <w:sz w:val="16"/>
               </w:rPr>
-              <w:t>OE-03/02-02</w:t>
+              <w:t>OE-03/01-02</w:t>
             </w:r>
           </w:p>
         </w:tc>
@@ -7058,7 +7058,7 @@
                 <w:i w:val="0"/>
                 <w:sz w:val="16"/>
               </w:rPr>
-              <w:t>OE-03 / 02-02 (ESTACIONAMIENTO DE AUTOS)</w:t>
+              <w:t>OE-03/01-02 (ESTACIONAMIENTO DE AUTOS)</w:t>
             </w:r>
           </w:p>
         </w:tc>
@@ -7148,7 +7148,7 @@
                 <w:color w:val="7B1E2B"/>
                 <w:sz w:val="16"/>
               </w:rPr>
-              <w:t>OE-04/01-02</w:t>
+              <w:t>OE-03/02-02</w:t>
             </w:r>
           </w:p>
         </w:tc>
@@ -7169,7 +7169,7 @@
                 <w:i w:val="0"/>
                 <w:sz w:val="16"/>
               </w:rPr>
-              <w:t>OE-04 / 01-02 (PATIO DE DESCARGA )</w:t>
+              <w:t>OE-03/02-02 (ESTACIONAMIENTO DE AUTOS)</w:t>
             </w:r>
           </w:p>
         </w:tc>
@@ -7259,7 +7259,7 @@
                 <w:color w:val="7B1E2B"/>
                 <w:sz w:val="16"/>
               </w:rPr>
-              <w:t>OE-04/02-02</w:t>
+              <w:t>OE-04/01-02</w:t>
             </w:r>
           </w:p>
         </w:tc>
@@ -7280,7 +7280,7 @@
                 <w:i w:val="0"/>
                 <w:sz w:val="16"/>
               </w:rPr>
-              <w:t>OE-04 / 02-02 (PATIO DE DESCARGA )</w:t>
+              <w:t>OE-04/01-02 (PATIO DE DESCARGA)</w:t>
             </w:r>
           </w:p>
         </w:tc>
@@ -7370,7 +7370,7 @@
                 <w:color w:val="7B1E2B"/>
                 <w:sz w:val="16"/>
               </w:rPr>
-              <w:t>OE-05/01-02</w:t>
+              <w:t>OE-04/02-02</w:t>
             </w:r>
           </w:p>
         </w:tc>
@@ -7391,7 +7391,7 @@
                 <w:i w:val="0"/>
                 <w:sz w:val="16"/>
               </w:rPr>
-              <w:t>OE-05 / 01-02 (CERCO PERIMÉTRICO)</w:t>
+              <w:t>OE-04/02-02 (PATIO DE DESCARGA)</w:t>
             </w:r>
           </w:p>
         </w:tc>
@@ -7481,7 +7481,7 @@
                 <w:color w:val="7B1E2B"/>
                 <w:sz w:val="16"/>
               </w:rPr>
-              <w:t>OE-05/02-02</w:t>
+              <w:t>OE-05/01-02</w:t>
             </w:r>
           </w:p>
         </w:tc>
@@ -7502,7 +7502,7 @@
                 <w:i w:val="0"/>
                 <w:sz w:val="16"/>
               </w:rPr>
-              <w:t>OE-05 / 02-02 (CERCO PERIMÉTRICO)</w:t>
+              <w:t>OE-05/01-02 (CERCO PERIMÉTRICO)</w:t>
             </w:r>
           </w:p>
         </w:tc>
@@ -7592,7 +7592,7 @@
                 <w:color w:val="7B1E2B"/>
                 <w:sz w:val="16"/>
               </w:rPr>
-              <w:t>OE-06/01-02</w:t>
+              <w:t>OE-05/02-02</w:t>
             </w:r>
           </w:p>
         </w:tc>
@@ -7613,7 +7613,7 @@
                 <w:i w:val="0"/>
                 <w:sz w:val="16"/>
               </w:rPr>
-              <w:t>OE-06 / 01-02 (TANQUE ELEVADO Y CISTERNA)</w:t>
+              <w:t>OE-05/02-02 (CERCO PERIMÉTRICO)</w:t>
             </w:r>
           </w:p>
         </w:tc>
@@ -7703,7 +7703,7 @@
                 <w:color w:val="7B1E2B"/>
                 <w:sz w:val="16"/>
               </w:rPr>
-              <w:t>OE-06/02-02</w:t>
+              <w:t>OE-06/01-02</w:t>
             </w:r>
           </w:p>
         </w:tc>
@@ -7724,7 +7724,7 @@
                 <w:i w:val="0"/>
                 <w:sz w:val="16"/>
               </w:rPr>
-              <w:t>OE-06 / 02-02 (TANQUE ELEVADO Y CISTERNA)</w:t>
+              <w:t>OE-06/01-02 (TANQUE ELEVADO Y CISTERNA)</w:t>
             </w:r>
           </w:p>
         </w:tc>
@@ -7814,7 +7814,7 @@
                 <w:color w:val="7B1E2B"/>
                 <w:sz w:val="16"/>
               </w:rPr>
-              <w:t>OE-07/01</w:t>
+              <w:t>OE-06/02-02</w:t>
             </w:r>
           </w:p>
         </w:tc>
@@ -7835,7 +7835,7 @@
                 <w:i w:val="0"/>
                 <w:sz w:val="16"/>
               </w:rPr>
-              <w:t>OE-07 / 01 (PTAR)</w:t>
+              <w:t>OE-06/02-02 (TANQUE ELEVADO Y CISTERNA)</w:t>
             </w:r>
           </w:p>
         </w:tc>
@@ -7888,9 +7888,50 @@
         </w:trPr>
         <w:tc>
           <w:tcPr>
-            <w:tcW w:type="dxa" w:w="9864"/>
-            <w:gridSpan w:val="5"/>
-            <w:shd w:val="clear" w:color="auto" w:fill="F2E6E8"/>
+            <w:tcW w:type="dxa" w:w="567"/>
+            <w:vAlign w:val="center"/>
+          </w:tcPr>
+          <w:p>
+            <w:pPr>
+              <w:spacing w:before="20" w:after="20" w:line="240" w:lineRule="auto"/>
+              <w:jc w:val="center"/>
+            </w:pPr>
+            <w:r>
+              <w:rPr>
+                <w:rFonts w:ascii="Arial" w:hAnsi="Arial" w:eastAsia="Arial"/>
+                <w:b w:val="0"/>
+                <w:i w:val="0"/>
+                <w:sz w:val="16"/>
+              </w:rPr>
+              <w:t>69</w:t>
+            </w:r>
+          </w:p>
+        </w:tc>
+        <w:tc>
+          <w:tcPr>
+            <w:tcW w:type="dxa" w:w="1474"/>
+            <w:vAlign w:val="center"/>
+          </w:tcPr>
+          <w:p>
+            <w:pPr>
+              <w:spacing w:before="20" w:after="20" w:line="240" w:lineRule="auto"/>
+              <w:jc w:val="center"/>
+            </w:pPr>
+            <w:r>
+              <w:rPr>
+                <w:rFonts w:ascii="Arial" w:hAnsi="Arial" w:eastAsia="Arial"/>
+                <w:b/>
+                <w:i w:val="0"/>
+                <w:color w:val="7B1E2B"/>
+                <w:sz w:val="16"/>
+              </w:rPr>
+              <w:t>OE-07/01</w:t>
+            </w:r>
+          </w:p>
+        </w:tc>
+        <w:tc>
+          <w:tcPr>
+            <w:tcW w:type="dxa" w:w="5953"/>
             <w:vAlign w:val="center"/>
           </w:tcPr>
           <w:p>
@@ -7903,10 +7944,51 @@
                 <w:rFonts w:ascii="Arial" w:hAnsi="Arial" w:eastAsia="Arial"/>
                 <w:b/>
                 <w:i w:val="0"/>
-                <w:color w:val="7B1E2B"/>
-                <w:sz w:val="15"/>
-              </w:rPr>
-              <w:t>V.  DETALLES DE ARQUITECTURA  (37)</w:t>
+                <w:sz w:val="16"/>
+              </w:rPr>
+              <w:t>OE-07 / 01 (PTAR)</w:t>
+            </w:r>
+          </w:p>
+        </w:tc>
+        <w:tc>
+          <w:tcPr>
+            <w:tcW w:type="dxa" w:w="1077"/>
+            <w:vAlign w:val="center"/>
+          </w:tcPr>
+          <w:p>
+            <w:pPr>
+              <w:spacing w:before="20" w:after="20" w:line="240" w:lineRule="auto"/>
+              <w:jc w:val="center"/>
+            </w:pPr>
+            <w:r>
+              <w:rPr>
+                <w:rFonts w:ascii="Arial" w:hAnsi="Arial" w:eastAsia="Arial"/>
+                <w:b w:val="0"/>
+                <w:i w:val="0"/>
+                <w:sz w:val="16"/>
+              </w:rPr>
+              <w:t>—</w:t>
+            </w:r>
+          </w:p>
+        </w:tc>
+        <w:tc>
+          <w:tcPr>
+            <w:tcW w:type="dxa" w:w="794"/>
+            <w:vAlign w:val="center"/>
+          </w:tcPr>
+          <w:p>
+            <w:pPr>
+              <w:spacing w:before="20" w:after="20" w:line="240" w:lineRule="auto"/>
+              <w:jc w:val="center"/>
+            </w:pPr>
+            <w:r>
+              <w:rPr>
+                <w:rFonts w:ascii="Arial" w:hAnsi="Arial" w:eastAsia="Arial"/>
+                <w:b w:val="0"/>
+                <w:i w:val="0"/>
+                <w:sz w:val="16"/>
+              </w:rPr>
+              <w:t>1</w:t>
             </w:r>
           </w:p>
         </w:tc>
@@ -7917,34 +7999,15 @@
         </w:trPr>
         <w:tc>
           <w:tcPr>
-            <w:tcW w:type="dxa" w:w="567"/>
-            <w:vAlign w:val="center"/>
-          </w:tcPr>
-          <w:p>
-            <w:pPr>
-              <w:spacing w:before="20" w:after="20" w:line="240" w:lineRule="auto"/>
-              <w:jc w:val="center"/>
-            </w:pPr>
-            <w:r>
-              <w:rPr>
-                <w:rFonts w:ascii="Arial" w:hAnsi="Arial" w:eastAsia="Arial"/>
-                <w:b w:val="0"/>
-                <w:i w:val="0"/>
-                <w:sz w:val="16"/>
-              </w:rPr>
-              <w:t>69</w:t>
-            </w:r>
-          </w:p>
-        </w:tc>
-        <w:tc>
-          <w:tcPr>
-            <w:tcW w:type="dxa" w:w="1474"/>
-            <w:vAlign w:val="center"/>
-          </w:tcPr>
-          <w:p>
-            <w:pPr>
-              <w:spacing w:before="20" w:after="20" w:line="240" w:lineRule="auto"/>
-              <w:jc w:val="center"/>
+            <w:tcW w:type="dxa" w:w="9864"/>
+            <w:gridSpan w:val="5"/>
+            <w:shd w:val="clear" w:color="auto" w:fill="F2E6E8"/>
+            <w:vAlign w:val="center"/>
+          </w:tcPr>
+          <w:p>
+            <w:pPr>
+              <w:spacing w:before="20" w:after="20" w:line="240" w:lineRule="auto"/>
+              <w:jc w:val="left"/>
             </w:pPr>
             <w:r>
               <w:rPr>
@@ -7952,72 +8015,9 @@
                 <w:b/>
                 <w:i w:val="0"/>
                 <w:color w:val="7B1E2B"/>
-                <w:sz w:val="16"/>
-              </w:rPr>
-              <w:t>DT-01/01</w:t>
-            </w:r>
-          </w:p>
-        </w:tc>
-        <w:tc>
-          <w:tcPr>
-            <w:tcW w:type="dxa" w:w="5953"/>
-            <w:vAlign w:val="center"/>
-          </w:tcPr>
-          <w:p>
-            <w:pPr>
-              <w:spacing w:before="20" w:after="20" w:line="240" w:lineRule="auto"/>
-              <w:jc w:val="left"/>
-            </w:pPr>
-            <w:r>
-              <w:rPr>
-                <w:rFonts w:ascii="Arial" w:hAnsi="Arial" w:eastAsia="Arial"/>
-                <w:b/>
-                <w:i w:val="0"/>
-                <w:sz w:val="16"/>
-              </w:rPr>
-              <w:t>PLANO DE DETALLES DE PUERTAS Y VENTANAS EDF-01</w:t>
-            </w:r>
-          </w:p>
-        </w:tc>
-        <w:tc>
-          <w:tcPr>
-            <w:tcW w:type="dxa" w:w="1077"/>
-            <w:vAlign w:val="center"/>
-          </w:tcPr>
-          <w:p>
-            <w:pPr>
-              <w:spacing w:before="20" w:after="20" w:line="240" w:lineRule="auto"/>
-              <w:jc w:val="center"/>
-            </w:pPr>
-            <w:r>
-              <w:rPr>
-                <w:rFonts w:ascii="Arial" w:hAnsi="Arial" w:eastAsia="Arial"/>
-                <w:b w:val="0"/>
-                <w:i w:val="0"/>
-                <w:sz w:val="16"/>
-              </w:rPr>
-              <w:t>A1</w:t>
-            </w:r>
-          </w:p>
-        </w:tc>
-        <w:tc>
-          <w:tcPr>
-            <w:tcW w:type="dxa" w:w="794"/>
-            <w:vAlign w:val="center"/>
-          </w:tcPr>
-          <w:p>
-            <w:pPr>
-              <w:spacing w:before="20" w:after="20" w:line="240" w:lineRule="auto"/>
-              <w:jc w:val="center"/>
-            </w:pPr>
-            <w:r>
-              <w:rPr>
-                <w:rFonts w:ascii="Arial" w:hAnsi="Arial" w:eastAsia="Arial"/>
-                <w:b w:val="0"/>
-                <w:i w:val="0"/>
-                <w:sz w:val="16"/>
-              </w:rPr>
-              <w:t>1</w:t>
+                <w:sz w:val="15"/>
+              </w:rPr>
+              <w:t>V.  DETALLES DE ARQUITECTURA  (37)</w:t>
             </w:r>
           </w:p>
         </w:tc>
@@ -8065,7 +8065,7 @@
                 <w:color w:val="7B1E2B"/>
                 <w:sz w:val="16"/>
               </w:rPr>
-              <w:t>DT-02/01</w:t>
+              <w:t>DT-01/01</w:t>
             </w:r>
           </w:p>
         </w:tc>
@@ -8086,7 +8086,7 @@
                 <w:i w:val="0"/>
                 <w:sz w:val="16"/>
               </w:rPr>
-              <w:t>PLANO DE DETALLES DE PUERTAS Y VENTANAS EDF-02</w:t>
+              <w:t>PLANO DE DETALLES DE PUERTAS Y VENTANAS EDF-01</w:t>
             </w:r>
           </w:p>
         </w:tc>
@@ -8176,7 +8176,7 @@
                 <w:color w:val="7B1E2B"/>
                 <w:sz w:val="16"/>
               </w:rPr>
-              <w:t>DT-03/01</w:t>
+              <w:t>DT-02/01</w:t>
             </w:r>
           </w:p>
         </w:tc>
@@ -8197,7 +8197,7 @@
                 <w:i w:val="0"/>
                 <w:sz w:val="16"/>
               </w:rPr>
-              <w:t>PLANO DE DETALLES DE PUERTAS Y VENTANAS EDF-03</w:t>
+              <w:t>PLANO DE DETALLES DE PUERTAS Y VENTANAS EDF-02</w:t>
             </w:r>
           </w:p>
         </w:tc>
@@ -8287,7 +8287,7 @@
                 <w:color w:val="7B1E2B"/>
                 <w:sz w:val="16"/>
               </w:rPr>
-              <w:t>DT-04/01</w:t>
+              <w:t>DT-03/01</w:t>
             </w:r>
           </w:p>
         </w:tc>
@@ -8308,7 +8308,7 @@
                 <w:i w:val="0"/>
                 <w:sz w:val="16"/>
               </w:rPr>
-              <w:t>PLANO DE DETALLES DE PUERTAS Y VENTANAS EDF-04</w:t>
+              <w:t>PLANO DE DETALLES DE PUERTAS Y VENTANAS EDF-03</w:t>
             </w:r>
           </w:p>
         </w:tc>
@@ -8398,7 +8398,7 @@
                 <w:color w:val="7B1E2B"/>
                 <w:sz w:val="16"/>
               </w:rPr>
-              <w:t>DT-05/01</w:t>
+              <w:t>DT-04/01</w:t>
             </w:r>
           </w:p>
         </w:tc>
@@ -8419,7 +8419,7 @@
                 <w:i w:val="0"/>
                 <w:sz w:val="16"/>
               </w:rPr>
-              <w:t>PLANO DE DETALLES DE PUERTAS Y VENTANAS EDF-05</w:t>
+              <w:t>PLANO DE DETALLES DE PUERTAS Y VENTANAS EDF-04</w:t>
             </w:r>
           </w:p>
         </w:tc>
@@ -8509,7 +8509,7 @@
                 <w:color w:val="7B1E2B"/>
                 <w:sz w:val="16"/>
               </w:rPr>
-              <w:t>DT-06/01</w:t>
+              <w:t>DT-05/01</w:t>
             </w:r>
           </w:p>
         </w:tc>
@@ -8530,7 +8530,7 @@
                 <w:i w:val="0"/>
                 <w:sz w:val="16"/>
               </w:rPr>
-              <w:t>PLANO DE DETALLES DE PUERTAS Y VENTANAS EDF-06</w:t>
+              <w:t>PLANO DE DETALLES DE PUERTAS Y VENTANAS EDF-05</w:t>
             </w:r>
           </w:p>
         </w:tc>
@@ -8620,7 +8620,7 @@
                 <w:color w:val="7B1E2B"/>
                 <w:sz w:val="16"/>
               </w:rPr>
-              <w:t>DT-07/01</w:t>
+              <w:t>DT-06/01</w:t>
             </w:r>
           </w:p>
         </w:tc>
@@ -8641,7 +8641,7 @@
                 <w:i w:val="0"/>
                 <w:sz w:val="16"/>
               </w:rPr>
-              <w:t>PLANO DE DETALLES DE PUERTAS Y VENTANAS EDF-07</w:t>
+              <w:t>PLANO DE DETALLES DE PUERTAS Y VENTANAS EDF-06</w:t>
             </w:r>
           </w:p>
         </w:tc>
@@ -8731,7 +8731,7 @@
                 <w:color w:val="7B1E2B"/>
                 <w:sz w:val="16"/>
               </w:rPr>
-              <w:t>DT-08/01</w:t>
+              <w:t>DT-07/01</w:t>
             </w:r>
           </w:p>
         </w:tc>
@@ -8752,7 +8752,7 @@
                 <w:i w:val="0"/>
                 <w:sz w:val="16"/>
               </w:rPr>
-              <w:t>PLANO DE DETALLES DE PUERTAS Y VENTANAS EDF-08</w:t>
+              <w:t>PLANO DE DETALLES DE PUERTAS Y VENTANAS EDF-07</w:t>
             </w:r>
           </w:p>
         </w:tc>
@@ -8842,7 +8842,7 @@
                 <w:color w:val="7B1E2B"/>
                 <w:sz w:val="16"/>
               </w:rPr>
-              <w:t>DT-09/01</w:t>
+              <w:t>DT-08/01</w:t>
             </w:r>
           </w:p>
         </w:tc>
@@ -8863,7 +8863,7 @@
                 <w:i w:val="0"/>
                 <w:sz w:val="16"/>
               </w:rPr>
-              <w:t>PLANO DE DETALLES DE PUERTAS Y VENTANAS EDF-09</w:t>
+              <w:t>PLANO DE DETALLES DE PUERTAS Y VENTANAS EDF-08</w:t>
             </w:r>
           </w:p>
         </w:tc>
@@ -8953,7 +8953,7 @@
                 <w:color w:val="7B1E2B"/>
                 <w:sz w:val="16"/>
               </w:rPr>
-              <w:t>DT-10/01</w:t>
+              <w:t>DT-09/01</w:t>
             </w:r>
           </w:p>
         </w:tc>
@@ -8974,7 +8974,7 @@
                 <w:i w:val="0"/>
                 <w:sz w:val="16"/>
               </w:rPr>
-              <w:t>PLANO DE DETALLES DE PUERTAS Y VENTANAS OE-01</w:t>
+              <w:t>PLANO DE DETALLES DE PUERTAS Y VENTANAS EDF-09</w:t>
             </w:r>
           </w:p>
         </w:tc>
@@ -9064,7 +9064,7 @@
                 <w:color w:val="7B1E2B"/>
                 <w:sz w:val="16"/>
               </w:rPr>
-              <w:t>DT-11/01</w:t>
+              <w:t>DT-10/01</w:t>
             </w:r>
           </w:p>
         </w:tc>
@@ -9085,7 +9085,7 @@
                 <w:i w:val="0"/>
                 <w:sz w:val="16"/>
               </w:rPr>
-              <w:t>PLANO DE DETALLES DE PUERTAS Y VENTANAS OE-06</w:t>
+              <w:t>PLANO DE DETALLES DE PUERTAS Y VENTANAS OE-01</w:t>
             </w:r>
           </w:p>
         </w:tc>
@@ -9175,7 +9175,7 @@
                 <w:color w:val="7B1E2B"/>
                 <w:sz w:val="16"/>
               </w:rPr>
-              <w:t>DT-12/01</w:t>
+              <w:t>DT-11/01</w:t>
             </w:r>
           </w:p>
         </w:tc>
@@ -9196,7 +9196,7 @@
                 <w:i w:val="0"/>
                 <w:sz w:val="16"/>
               </w:rPr>
-              <w:t>CORTES TÍPICOS DE VENTANAS DE MADERA</w:t>
+              <w:t>PLANO DE DETALLES DE PUERTAS Y VENTANAS OE-06</w:t>
             </w:r>
           </w:p>
         </w:tc>
@@ -9217,7 +9217,7 @@
                 <w:i w:val="0"/>
                 <w:sz w:val="16"/>
               </w:rPr>
-              <w:t>A0</w:t>
+              <w:t>A1</w:t>
             </w:r>
           </w:p>
         </w:tc>
@@ -9286,7 +9286,7 @@
                 <w:color w:val="7B1E2B"/>
                 <w:sz w:val="16"/>
               </w:rPr>
-              <w:t>DT-13/01</w:t>
+              <w:t>DT-12/01</w:t>
             </w:r>
           </w:p>
         </w:tc>
@@ -9307,7 +9307,7 @@
                 <w:i w:val="0"/>
                 <w:sz w:val="16"/>
               </w:rPr>
-              <w:t>CORTES TÍPICOS DE PUERTAS DE MADERA</w:t>
+              <w:t>CORTES TÍPICOS DE VENTANAS DE MADERA</w:t>
             </w:r>
           </w:p>
         </w:tc>
@@ -9397,7 +9397,7 @@
                 <w:color w:val="7B1E2B"/>
                 <w:sz w:val="16"/>
               </w:rPr>
-              <w:t>DT-14/01</w:t>
+              <w:t>DT-13/01</w:t>
             </w:r>
           </w:p>
         </w:tc>
@@ -9418,7 +9418,7 @@
                 <w:i w:val="0"/>
                 <w:sz w:val="16"/>
               </w:rPr>
-              <w:t>CORTES TÍPICOS DE PUERTAS METÁLICAS</w:t>
+              <w:t>CORTES TÍPICOS DE PUERTAS DE MADERA</w:t>
             </w:r>
           </w:p>
         </w:tc>
@@ -9508,7 +9508,7 @@
                 <w:color w:val="7B1E2B"/>
                 <w:sz w:val="16"/>
               </w:rPr>
-              <w:t>DT-15/01</w:t>
+              <w:t>DT-14/01</w:t>
             </w:r>
           </w:p>
         </w:tc>
@@ -9529,7 +9529,7 @@
                 <w:i w:val="0"/>
                 <w:sz w:val="16"/>
               </w:rPr>
-              <w:t>CORTES TÍPICOS DE PUERTAS Y VENTANAS DE VIDRIO</w:t>
+              <w:t>CORTES TÍPICOS DE PUERTAS METÁLICAS</w:t>
             </w:r>
           </w:p>
         </w:tc>
@@ -9619,7 +9619,7 @@
                 <w:color w:val="7B1E2B"/>
                 <w:sz w:val="16"/>
               </w:rPr>
-              <w:t>DT-16/01</w:t>
+              <w:t>DT-15/01</w:t>
             </w:r>
           </w:p>
         </w:tc>
@@ -9640,7 +9640,7 @@
                 <w:i w:val="0"/>
                 <w:sz w:val="16"/>
               </w:rPr>
-              <w:t>PLANO DE DETALLE - FALSO CIELORRASO EDIF. 01</w:t>
+              <w:t>CORTES TÍPICOS DE PUERTAS Y VENTANAS DE VIDRIO</w:t>
             </w:r>
           </w:p>
         </w:tc>
@@ -9661,7 +9661,7 @@
                 <w:i w:val="0"/>
                 <w:sz w:val="16"/>
               </w:rPr>
-              <w:t>A1</w:t>
+              <w:t>A0</w:t>
             </w:r>
           </w:p>
         </w:tc>
@@ -9730,7 +9730,7 @@
                 <w:color w:val="7B1E2B"/>
                 <w:sz w:val="16"/>
               </w:rPr>
-              <w:t>DT-17/1</w:t>
+              <w:t>DT-16/01</w:t>
             </w:r>
           </w:p>
         </w:tc>
@@ -9751,7 +9751,7 @@
                 <w:i w:val="0"/>
                 <w:sz w:val="16"/>
               </w:rPr>
-              <w:t>PLANO DE DETALLE - FALSO CIELORRASO EDIF. 02 y 03</w:t>
+              <w:t>PLANO DE DETALLE - FALSO CIELORRASO EDIF. 01</w:t>
             </w:r>
           </w:p>
         </w:tc>
@@ -9841,7 +9841,7 @@
                 <w:color w:val="7B1E2B"/>
                 <w:sz w:val="16"/>
               </w:rPr>
-              <w:t>DT-18/1</w:t>
+              <w:t>DT-17/1</w:t>
             </w:r>
           </w:p>
         </w:tc>
@@ -9862,7 +9862,7 @@
                 <w:i w:val="0"/>
                 <w:sz w:val="16"/>
               </w:rPr>
-              <w:t>PLANO DE DETALLE - FALSO CIELORRASO EDIF. 04</w:t>
+              <w:t>PLANO DE DETALLE - FALSO CIELORRASO EDIF. 02 y 03</w:t>
             </w:r>
           </w:p>
         </w:tc>
@@ -9952,7 +9952,7 @@
                 <w:color w:val="7B1E2B"/>
                 <w:sz w:val="16"/>
               </w:rPr>
-              <w:t>DT-19/1</w:t>
+              <w:t>DT-18/1</w:t>
             </w:r>
           </w:p>
         </w:tc>
@@ -9973,7 +9973,7 @@
                 <w:i w:val="0"/>
                 <w:sz w:val="16"/>
               </w:rPr>
-              <w:t>PLANO DE DETALLE - FALSO CIELORRASO EDIF. 05</w:t>
+              <w:t>PLANO DE DETALLE - FALSO CIELORRASO EDIF. 04</w:t>
             </w:r>
           </w:p>
         </w:tc>
@@ -10063,7 +10063,7 @@
                 <w:color w:val="7B1E2B"/>
                 <w:sz w:val="16"/>
               </w:rPr>
-              <w:t>DT-20/1</w:t>
+              <w:t>DT-19/1</w:t>
             </w:r>
           </w:p>
         </w:tc>
@@ -10084,7 +10084,7 @@
                 <w:i w:val="0"/>
                 <w:sz w:val="16"/>
               </w:rPr>
-              <w:t>PLANO DE DETALLE - FALSO CIELORRASO EDIF. 06 y 08</w:t>
+              <w:t>PLANO DE DETALLE - FALSO CIELORRASO EDIF. 05</w:t>
             </w:r>
           </w:p>
         </w:tc>
@@ -10174,7 +10174,7 @@
                 <w:color w:val="7B1E2B"/>
                 <w:sz w:val="16"/>
               </w:rPr>
-              <w:t>DT-21/1</w:t>
+              <w:t>DT-20/1</w:t>
             </w:r>
           </w:p>
         </w:tc>
@@ -10195,7 +10195,7 @@
                 <w:i w:val="0"/>
                 <w:sz w:val="16"/>
               </w:rPr>
-              <w:t>PLANO DE DETALLE - FALSO CIELORRASO EDIF. 07</w:t>
+              <w:t>PLANO DE DETALLE - FALSO CIELORRASO EDIF. 06 y 08</w:t>
             </w:r>
           </w:p>
         </w:tc>
@@ -10285,7 +10285,7 @@
                 <w:color w:val="7B1E2B"/>
                 <w:sz w:val="16"/>
               </w:rPr>
-              <w:t>DT-22/1</w:t>
+              <w:t>DT-21/1</w:t>
             </w:r>
           </w:p>
         </w:tc>
@@ -10306,7 +10306,7 @@
                 <w:i w:val="0"/>
                 <w:sz w:val="16"/>
               </w:rPr>
-              <w:t>PLANO DE DETALLE - FALSO CIELORRASO EDIF. 09</w:t>
+              <w:t>PLANO DE DETALLE - FALSO CIELORRASO EDIF. 07</w:t>
             </w:r>
           </w:p>
         </w:tc>
@@ -10396,7 +10396,7 @@
                 <w:color w:val="7B1E2B"/>
                 <w:sz w:val="16"/>
               </w:rPr>
-              <w:t>DT-23/1</w:t>
+              <w:t>DT-22/1</w:t>
             </w:r>
           </w:p>
         </w:tc>
@@ -10417,7 +10417,7 @@
                 <w:i w:val="0"/>
                 <w:sz w:val="16"/>
               </w:rPr>
-              <w:t>DETALLE DE SS.HH</w:t>
+              <w:t>PLANO DE DETALLE - FALSO CIELORRASO EDIF. 09</w:t>
             </w:r>
           </w:p>
         </w:tc>
@@ -10438,7 +10438,7 @@
                 <w:i w:val="0"/>
                 <w:sz w:val="16"/>
               </w:rPr>
-              <w:t>—</w:t>
+              <w:t>A1</w:t>
             </w:r>
           </w:p>
         </w:tc>
@@ -10507,7 +10507,7 @@
                 <w:color w:val="7B1E2B"/>
                 <w:sz w:val="16"/>
               </w:rPr>
-              <w:t>DT-24/1</w:t>
+              <w:t>DT-23/1</w:t>
             </w:r>
           </w:p>
         </w:tc>
@@ -10618,7 +10618,7 @@
                 <w:color w:val="7B1E2B"/>
                 <w:sz w:val="16"/>
               </w:rPr>
-              <w:t>DT-25/1</w:t>
+              <w:t>DT-24/1</w:t>
             </w:r>
           </w:p>
         </w:tc>
@@ -10729,7 +10729,7 @@
                 <w:color w:val="7B1E2B"/>
                 <w:sz w:val="16"/>
               </w:rPr>
-              <w:t>DT-26/1</w:t>
+              <w:t>DT-25/1</w:t>
             </w:r>
           </w:p>
         </w:tc>
@@ -10840,7 +10840,7 @@
                 <w:color w:val="7B1E2B"/>
                 <w:sz w:val="16"/>
               </w:rPr>
-              <w:t>DT-27/1</w:t>
+              <w:t>DT-26/1</w:t>
             </w:r>
           </w:p>
         </w:tc>
@@ -10951,7 +10951,7 @@
                 <w:color w:val="7B1E2B"/>
                 <w:sz w:val="16"/>
               </w:rPr>
-              <w:t>DT-28/1</w:t>
+              <w:t>DT-27/1</w:t>
             </w:r>
           </w:p>
         </w:tc>
@@ -11062,7 +11062,7 @@
                 <w:color w:val="7B1E2B"/>
                 <w:sz w:val="16"/>
               </w:rPr>
-              <w:t>DT-29/1</w:t>
+              <w:t>DT-28/1</w:t>
             </w:r>
           </w:p>
         </w:tc>
@@ -11173,7 +11173,7 @@
                 <w:color w:val="7B1E2B"/>
                 <w:sz w:val="16"/>
               </w:rPr>
-              <w:t>DT-30/1</w:t>
+              <w:t>DT-29/1</w:t>
             </w:r>
           </w:p>
         </w:tc>
@@ -11194,7 +11194,7 @@
                 <w:i w:val="0"/>
                 <w:sz w:val="16"/>
               </w:rPr>
-              <w:t>PLANO DE DETALLE DE PISOS</w:t>
+              <w:t>DETALLE DE SS.HH</w:t>
             </w:r>
           </w:p>
         </w:tc>
@@ -11284,7 +11284,7 @@
                 <w:color w:val="7B1E2B"/>
                 <w:sz w:val="16"/>
               </w:rPr>
-              <w:t>DT-31/1-2</w:t>
+              <w:t>DT-30/1</w:t>
             </w:r>
           </w:p>
         </w:tc>
@@ -11305,7 +11305,7 @@
                 <w:i w:val="0"/>
                 <w:sz w:val="16"/>
               </w:rPr>
-              <w:t>PLANO DE DETALLE DE COCINA</w:t>
+              <w:t>PLANO DE DETALLE DE PISOS</w:t>
             </w:r>
           </w:p>
         </w:tc>
@@ -11395,7 +11395,7 @@
                 <w:color w:val="7B1E2B"/>
                 <w:sz w:val="16"/>
               </w:rPr>
-              <w:t>DT-32/2-2</w:t>
+              <w:t>DT-31/1-2</w:t>
             </w:r>
           </w:p>
         </w:tc>
@@ -11506,7 +11506,7 @@
                 <w:color w:val="7B1E2B"/>
                 <w:sz w:val="16"/>
               </w:rPr>
-              <w:t>DT-33/1-2</w:t>
+              <w:t>DT-32/2-2</w:t>
             </w:r>
           </w:p>
         </w:tc>
@@ -11527,7 +11527,7 @@
                 <w:i w:val="0"/>
                 <w:sz w:val="16"/>
               </w:rPr>
-              <w:t>PLANO DE DETALLE DE POZA DE LAVADO</w:t>
+              <w:t>PLANO DE DETALLE DE COCINA</w:t>
             </w:r>
           </w:p>
         </w:tc>
@@ -11617,7 +11617,7 @@
                 <w:color w:val="7B1E2B"/>
                 <w:sz w:val="16"/>
               </w:rPr>
-              <w:t>DT-34/2-2</w:t>
+              <w:t>DT-33/1-2</w:t>
             </w:r>
           </w:p>
         </w:tc>
@@ -11728,7 +11728,7 @@
                 <w:color w:val="7B1E2B"/>
                 <w:sz w:val="16"/>
               </w:rPr>
-              <w:t>DT-35/1-2</w:t>
+              <w:t>DT-34/2-2</w:t>
             </w:r>
           </w:p>
         </w:tc>
@@ -11749,7 +11749,7 @@
                 <w:i w:val="0"/>
                 <w:sz w:val="16"/>
               </w:rPr>
-              <w:t>PLANO DE DETALLE DE MESA DE TRABAJO</w:t>
+              <w:t>PLANO DE DETALLE DE POZA DE LAVADO</w:t>
             </w:r>
           </w:p>
         </w:tc>
@@ -11839,7 +11839,7 @@
                 <w:color w:val="7B1E2B"/>
                 <w:sz w:val="16"/>
               </w:rPr>
-              <w:t>DT-36/2-2</w:t>
+              <w:t>DT-35/1-2</w:t>
             </w:r>
           </w:p>
         </w:tc>
@@ -11950,7 +11950,7 @@
                 <w:color w:val="7B1E2B"/>
                 <w:sz w:val="16"/>
               </w:rPr>
-              <w:t>DT-37/2-2</w:t>
+              <w:t>DT-36/2-2</w:t>
             </w:r>
           </w:p>
         </w:tc>
@@ -11971,7 +11971,7 @@
                 <w:i w:val="0"/>
                 <w:sz w:val="16"/>
               </w:rPr>
-              <w:t>PLANO DE DETALLE DE LUMINARIA EXTERIOR</w:t>
+              <w:t>PLANO DE DETALLE DE MESA DE TRABAJO</w:t>
             </w:r>
           </w:p>
         </w:tc>
@@ -12024,9 +12024,50 @@
         </w:trPr>
         <w:tc>
           <w:tcPr>
-            <w:tcW w:type="dxa" w:w="9864"/>
-            <w:gridSpan w:val="5"/>
-            <w:shd w:val="clear" w:color="auto" w:fill="F2E6E8"/>
+            <w:tcW w:type="dxa" w:w="567"/>
+            <w:vAlign w:val="center"/>
+          </w:tcPr>
+          <w:p>
+            <w:pPr>
+              <w:spacing w:before="20" w:after="20" w:line="240" w:lineRule="auto"/>
+              <w:jc w:val="center"/>
+            </w:pPr>
+            <w:r>
+              <w:rPr>
+                <w:rFonts w:ascii="Arial" w:hAnsi="Arial" w:eastAsia="Arial"/>
+                <w:b w:val="0"/>
+                <w:i w:val="0"/>
+                <w:sz w:val="16"/>
+              </w:rPr>
+              <w:t>106</w:t>
+            </w:r>
+          </w:p>
+        </w:tc>
+        <w:tc>
+          <w:tcPr>
+            <w:tcW w:type="dxa" w:w="1474"/>
+            <w:vAlign w:val="center"/>
+          </w:tcPr>
+          <w:p>
+            <w:pPr>
+              <w:spacing w:before="20" w:after="20" w:line="240" w:lineRule="auto"/>
+              <w:jc w:val="center"/>
+            </w:pPr>
+            <w:r>
+              <w:rPr>
+                <w:rFonts w:ascii="Arial" w:hAnsi="Arial" w:eastAsia="Arial"/>
+                <w:b/>
+                <w:i w:val="0"/>
+                <w:color w:val="7B1E2B"/>
+                <w:sz w:val="16"/>
+              </w:rPr>
+              <w:t>DT-37/2-2</w:t>
+            </w:r>
+          </w:p>
+        </w:tc>
+        <w:tc>
+          <w:tcPr>
+            <w:tcW w:type="dxa" w:w="5953"/>
             <w:vAlign w:val="center"/>
           </w:tcPr>
           <w:p>
@@ -12039,10 +12080,51 @@
                 <w:rFonts w:ascii="Arial" w:hAnsi="Arial" w:eastAsia="Arial"/>
                 <w:b/>
                 <w:i w:val="0"/>
-                <w:color w:val="7B1E2B"/>
-                <w:sz w:val="15"/>
-              </w:rPr>
-              <w:t>VI.  EVACUACIÓN Y SEÑALIZACIÓN  (2)</w:t>
+                <w:sz w:val="16"/>
+              </w:rPr>
+              <w:t>PLANO DE DETALLE DE LUMINARIA EXTERIOR</w:t>
+            </w:r>
+          </w:p>
+        </w:tc>
+        <w:tc>
+          <w:tcPr>
+            <w:tcW w:type="dxa" w:w="1077"/>
+            <w:vAlign w:val="center"/>
+          </w:tcPr>
+          <w:p>
+            <w:pPr>
+              <w:spacing w:before="20" w:after="20" w:line="240" w:lineRule="auto"/>
+              <w:jc w:val="center"/>
+            </w:pPr>
+            <w:r>
+              <w:rPr>
+                <w:rFonts w:ascii="Arial" w:hAnsi="Arial" w:eastAsia="Arial"/>
+                <w:b w:val="0"/>
+                <w:i w:val="0"/>
+                <w:sz w:val="16"/>
+              </w:rPr>
+              <w:t>—</w:t>
+            </w:r>
+          </w:p>
+        </w:tc>
+        <w:tc>
+          <w:tcPr>
+            <w:tcW w:type="dxa" w:w="794"/>
+            <w:vAlign w:val="center"/>
+          </w:tcPr>
+          <w:p>
+            <w:pPr>
+              <w:spacing w:before="20" w:after="20" w:line="240" w:lineRule="auto"/>
+              <w:jc w:val="center"/>
+            </w:pPr>
+            <w:r>
+              <w:rPr>
+                <w:rFonts w:ascii="Arial" w:hAnsi="Arial" w:eastAsia="Arial"/>
+                <w:b w:val="0"/>
+                <w:i w:val="0"/>
+                <w:sz w:val="16"/>
+              </w:rPr>
+              <w:t>1</w:t>
             </w:r>
           </w:p>
         </w:tc>
@@ -12053,34 +12135,15 @@
         </w:trPr>
         <w:tc>
           <w:tcPr>
-            <w:tcW w:type="dxa" w:w="567"/>
-            <w:vAlign w:val="center"/>
-          </w:tcPr>
-          <w:p>
-            <w:pPr>
-              <w:spacing w:before="20" w:after="20" w:line="240" w:lineRule="auto"/>
-              <w:jc w:val="center"/>
-            </w:pPr>
-            <w:r>
-              <w:rPr>
-                <w:rFonts w:ascii="Arial" w:hAnsi="Arial" w:eastAsia="Arial"/>
-                <w:b w:val="0"/>
-                <w:i w:val="0"/>
-                <w:sz w:val="16"/>
-              </w:rPr>
-              <w:t>106</w:t>
-            </w:r>
-          </w:p>
-        </w:tc>
-        <w:tc>
-          <w:tcPr>
-            <w:tcW w:type="dxa" w:w="1474"/>
-            <w:vAlign w:val="center"/>
-          </w:tcPr>
-          <w:p>
-            <w:pPr>
-              <w:spacing w:before="20" w:after="20" w:line="240" w:lineRule="auto"/>
-              <w:jc w:val="center"/>
+            <w:tcW w:type="dxa" w:w="9864"/>
+            <w:gridSpan w:val="5"/>
+            <w:shd w:val="clear" w:color="auto" w:fill="F2E6E8"/>
+            <w:vAlign w:val="center"/>
+          </w:tcPr>
+          <w:p>
+            <w:pPr>
+              <w:spacing w:before="20" w:after="20" w:line="240" w:lineRule="auto"/>
+              <w:jc w:val="left"/>
             </w:pPr>
             <w:r>
               <w:rPr>
@@ -12088,72 +12151,9 @@
                 <w:b/>
                 <w:i w:val="0"/>
                 <w:color w:val="7B1E2B"/>
-                <w:sz w:val="16"/>
-              </w:rPr>
-              <w:t>SE-S-01</w:t>
-            </w:r>
-          </w:p>
-        </w:tc>
-        <w:tc>
-          <w:tcPr>
-            <w:tcW w:type="dxa" w:w="5953"/>
-            <w:vAlign w:val="center"/>
-          </w:tcPr>
-          <w:p>
-            <w:pPr>
-              <w:spacing w:before="20" w:after="20" w:line="240" w:lineRule="auto"/>
-              <w:jc w:val="left"/>
-            </w:pPr>
-            <w:r>
-              <w:rPr>
-                <w:rFonts w:ascii="Arial" w:hAnsi="Arial" w:eastAsia="Arial"/>
-                <w:b/>
-                <w:i w:val="0"/>
-                <w:sz w:val="16"/>
-              </w:rPr>
-              <w:t>PLANTA GENERAL DE EVACUACIÓN</w:t>
-            </w:r>
-          </w:p>
-        </w:tc>
-        <w:tc>
-          <w:tcPr>
-            <w:tcW w:type="dxa" w:w="1077"/>
-            <w:vAlign w:val="center"/>
-          </w:tcPr>
-          <w:p>
-            <w:pPr>
-              <w:spacing w:before="20" w:after="20" w:line="240" w:lineRule="auto"/>
-              <w:jc w:val="center"/>
-            </w:pPr>
-            <w:r>
-              <w:rPr>
-                <w:rFonts w:ascii="Arial" w:hAnsi="Arial" w:eastAsia="Arial"/>
-                <w:b w:val="0"/>
-                <w:i w:val="0"/>
-                <w:sz w:val="16"/>
-              </w:rPr>
-              <w:t>—</w:t>
-            </w:r>
-          </w:p>
-        </w:tc>
-        <w:tc>
-          <w:tcPr>
-            <w:tcW w:type="dxa" w:w="794"/>
-            <w:vAlign w:val="center"/>
-          </w:tcPr>
-          <w:p>
-            <w:pPr>
-              <w:spacing w:before="20" w:after="20" w:line="240" w:lineRule="auto"/>
-              <w:jc w:val="center"/>
-            </w:pPr>
-            <w:r>
-              <w:rPr>
-                <w:rFonts w:ascii="Arial" w:hAnsi="Arial" w:eastAsia="Arial"/>
-                <w:b w:val="0"/>
-                <w:i w:val="0"/>
-                <w:sz w:val="16"/>
-              </w:rPr>
-              <w:t>1</w:t>
+                <w:sz w:val="15"/>
+              </w:rPr>
+              <w:t>VI.  EVACUACIÓN Y SEÑALIZACIÓN  (2)</w:t>
             </w:r>
           </w:p>
         </w:tc>
@@ -12180,6 +12180,117 @@
                 <w:sz w:val="16"/>
               </w:rPr>
               <w:t>107</w:t>
+            </w:r>
+          </w:p>
+        </w:tc>
+        <w:tc>
+          <w:tcPr>
+            <w:tcW w:type="dxa" w:w="1474"/>
+            <w:vAlign w:val="center"/>
+          </w:tcPr>
+          <w:p>
+            <w:pPr>
+              <w:spacing w:before="20" w:after="20" w:line="240" w:lineRule="auto"/>
+              <w:jc w:val="center"/>
+            </w:pPr>
+            <w:r>
+              <w:rPr>
+                <w:rFonts w:ascii="Arial" w:hAnsi="Arial" w:eastAsia="Arial"/>
+                <w:b/>
+                <w:i w:val="0"/>
+                <w:color w:val="7B1E2B"/>
+                <w:sz w:val="16"/>
+              </w:rPr>
+              <w:t>SE-S-01</w:t>
+            </w:r>
+          </w:p>
+        </w:tc>
+        <w:tc>
+          <w:tcPr>
+            <w:tcW w:type="dxa" w:w="5953"/>
+            <w:vAlign w:val="center"/>
+          </w:tcPr>
+          <w:p>
+            <w:pPr>
+              <w:spacing w:before="20" w:after="20" w:line="240" w:lineRule="auto"/>
+              <w:jc w:val="left"/>
+            </w:pPr>
+            <w:r>
+              <w:rPr>
+                <w:rFonts w:ascii="Arial" w:hAnsi="Arial" w:eastAsia="Arial"/>
+                <w:b/>
+                <w:i w:val="0"/>
+                <w:sz w:val="16"/>
+              </w:rPr>
+              <w:t>PLANTA GENERAL DE EVACUACIÓN</w:t>
+            </w:r>
+          </w:p>
+        </w:tc>
+        <w:tc>
+          <w:tcPr>
+            <w:tcW w:type="dxa" w:w="1077"/>
+            <w:vAlign w:val="center"/>
+          </w:tcPr>
+          <w:p>
+            <w:pPr>
+              <w:spacing w:before="20" w:after="20" w:line="240" w:lineRule="auto"/>
+              <w:jc w:val="center"/>
+            </w:pPr>
+            <w:r>
+              <w:rPr>
+                <w:rFonts w:ascii="Arial" w:hAnsi="Arial" w:eastAsia="Arial"/>
+                <w:b w:val="0"/>
+                <w:i w:val="0"/>
+                <w:sz w:val="16"/>
+              </w:rPr>
+              <w:t>—</w:t>
+            </w:r>
+          </w:p>
+        </w:tc>
+        <w:tc>
+          <w:tcPr>
+            <w:tcW w:type="dxa" w:w="794"/>
+            <w:vAlign w:val="center"/>
+          </w:tcPr>
+          <w:p>
+            <w:pPr>
+              <w:spacing w:before="20" w:after="20" w:line="240" w:lineRule="auto"/>
+              <w:jc w:val="center"/>
+            </w:pPr>
+            <w:r>
+              <w:rPr>
+                <w:rFonts w:ascii="Arial" w:hAnsi="Arial" w:eastAsia="Arial"/>
+                <w:b w:val="0"/>
+                <w:i w:val="0"/>
+                <w:sz w:val="16"/>
+              </w:rPr>
+              <w:t>1</w:t>
+            </w:r>
+          </w:p>
+        </w:tc>
+      </w:tr>
+      <w:tr>
+        <w:trPr>
+          <w:cantSplit/>
+        </w:trPr>
+        <w:tc>
+          <w:tcPr>
+            <w:tcW w:type="dxa" w:w="567"/>
+            <w:vAlign w:val="center"/>
+          </w:tcPr>
+          <w:p>
+            <w:pPr>
+              <w:spacing w:before="20" w:after="20" w:line="240" w:lineRule="auto"/>
+              <w:jc w:val="center"/>
+            </w:pPr>
+            <w:r>
+              <w:rPr>
+                <w:rFonts w:ascii="Arial" w:hAnsi="Arial" w:eastAsia="Arial"/>
+                <w:b w:val="0"/>
+                <w:i w:val="0"/>
+                <w:sz w:val="16"/>
+              </w:rPr>
+              <w:t>108</w:t>
             </w:r>
           </w:p>
         </w:tc>
@@ -12282,7 +12393,7 @@
           <w:i w:val="0"/>
           <w:sz w:val="18"/>
         </w:rPr>
-        <w:t>Total: 107 láminas (4 en A0, 58 en A1, 1 en A3, 44 sin formato indicado).</w:t>
+        <w:t>Total: 108 láminas (4 en A0, 59 en A1, 1 en A3, 44 sin formato indicado).</w:t>
       </w:r>
     </w:p>
     <w:p>
@@ -12305,7 +12416,7 @@
       <w:headerReference w:type="default" r:id="rId9"/>
       <w:footerReference w:type="default" r:id="rId10"/>
       <w:pgSz w:w="11906" w:h="16838"/>
-      <w:pgMar w:top="1134" w:right="907" w:bottom="907" w:left="1134" w:header="510" w:footer="454" w:gutter="0"/>
+      <w:pgMar w:top="964" w:right="907" w:bottom="794" w:left="1134" w:header="510" w:footer="454" w:gutter="0"/>
       <w:cols w:space="720"/>
       <w:docGrid w:linePitch="360"/>
     </w:sectPr>

</xml_diff>

<commit_message>
Hogar de Refugio: índice de planos de arquitectura con el Excel v3 (116 láminas, con equipamiento y mobiliario)
Co-Authored-By: Claude Opus 5.5 <noreply@anthropic.com>
Claude-Session: https://claude.ai/code/session_0142t8T16igb3VKxUPwnQPq6
</commit_message>
<xml_diff>
--- a/entregables/INDICE_DE_PLANOS_ARQUITECTURA_HOGAR_REFUGIO.docx
+++ b/entregables/INDICE_DE_PLANOS_ARQUITECTURA_HOGAR_REFUGIO.docx
@@ -5052,7 +5052,7 @@
                 <w:i w:val="0"/>
                 <w:sz w:val="16"/>
               </w:rPr>
-              <w:t>—</w:t>
+              <w:t>A1</w:t>
             </w:r>
           </w:p>
         </w:tc>
@@ -5163,7 +5163,7 @@
                 <w:i w:val="0"/>
                 <w:sz w:val="16"/>
               </w:rPr>
-              <w:t>—</w:t>
+              <w:t>A1</w:t>
             </w:r>
           </w:p>
         </w:tc>
@@ -5274,7 +5274,7 @@
                 <w:i w:val="0"/>
                 <w:sz w:val="16"/>
               </w:rPr>
-              <w:t>—</w:t>
+              <w:t>A1</w:t>
             </w:r>
           </w:p>
         </w:tc>
@@ -5385,7 +5385,7 @@
                 <w:i w:val="0"/>
                 <w:sz w:val="16"/>
               </w:rPr>
-              <w:t>—</w:t>
+              <w:t>A1</w:t>
             </w:r>
           </w:p>
         </w:tc>
@@ -5496,7 +5496,7 @@
                 <w:i w:val="0"/>
                 <w:sz w:val="16"/>
               </w:rPr>
-              <w:t>—</w:t>
+              <w:t>A1</w:t>
             </w:r>
           </w:p>
         </w:tc>
@@ -5607,7 +5607,7 @@
                 <w:i w:val="0"/>
                 <w:sz w:val="16"/>
               </w:rPr>
-              <w:t>—</w:t>
+              <w:t>A1</w:t>
             </w:r>
           </w:p>
         </w:tc>
@@ -5718,7 +5718,7 @@
                 <w:i w:val="0"/>
                 <w:sz w:val="16"/>
               </w:rPr>
-              <w:t>—</w:t>
+              <w:t>A1</w:t>
             </w:r>
           </w:p>
         </w:tc>
@@ -5829,7 +5829,7 @@
                 <w:i w:val="0"/>
                 <w:sz w:val="16"/>
               </w:rPr>
-              <w:t>—</w:t>
+              <w:t>A1</w:t>
             </w:r>
           </w:p>
         </w:tc>
@@ -5940,7 +5940,7 @@
                 <w:i w:val="0"/>
                 <w:sz w:val="16"/>
               </w:rPr>
-              <w:t>—</w:t>
+              <w:t>A1</w:t>
             </w:r>
           </w:p>
         </w:tc>
@@ -6051,7 +6051,7 @@
                 <w:i w:val="0"/>
                 <w:sz w:val="16"/>
               </w:rPr>
-              <w:t>—</w:t>
+              <w:t>A1</w:t>
             </w:r>
           </w:p>
         </w:tc>
@@ -6162,7 +6162,7 @@
                 <w:i w:val="0"/>
                 <w:sz w:val="16"/>
               </w:rPr>
-              <w:t>—</w:t>
+              <w:t>A1</w:t>
             </w:r>
           </w:p>
         </w:tc>
@@ -6273,7 +6273,7 @@
                 <w:i w:val="0"/>
                 <w:sz w:val="16"/>
               </w:rPr>
-              <w:t>—</w:t>
+              <w:t>A1</w:t>
             </w:r>
           </w:p>
         </w:tc>
@@ -6384,7 +6384,7 @@
                 <w:i w:val="0"/>
                 <w:sz w:val="16"/>
               </w:rPr>
-              <w:t>—</w:t>
+              <w:t>A1</w:t>
             </w:r>
           </w:p>
         </w:tc>
@@ -6495,7 +6495,7 @@
                 <w:i w:val="0"/>
                 <w:sz w:val="16"/>
               </w:rPr>
-              <w:t>—</w:t>
+              <w:t>A1</w:t>
             </w:r>
           </w:p>
         </w:tc>
@@ -6606,7 +6606,7 @@
                 <w:i w:val="0"/>
                 <w:sz w:val="16"/>
               </w:rPr>
-              <w:t>—</w:t>
+              <w:t>A1</w:t>
             </w:r>
           </w:p>
         </w:tc>
@@ -6746,7 +6746,7 @@
                 <w:i w:val="0"/>
                 <w:sz w:val="16"/>
               </w:rPr>
-              <w:t>—</w:t>
+              <w:t>A1</w:t>
             </w:r>
           </w:p>
         </w:tc>
@@ -6857,7 +6857,7 @@
                 <w:i w:val="0"/>
                 <w:sz w:val="16"/>
               </w:rPr>
-              <w:t>—</w:t>
+              <w:t>A1</w:t>
             </w:r>
           </w:p>
         </w:tc>
@@ -6968,7 +6968,7 @@
                 <w:i w:val="0"/>
                 <w:sz w:val="16"/>
               </w:rPr>
-              <w:t>—</w:t>
+              <w:t>A1</w:t>
             </w:r>
           </w:p>
         </w:tc>
@@ -7079,7 +7079,7 @@
                 <w:i w:val="0"/>
                 <w:sz w:val="16"/>
               </w:rPr>
-              <w:t>—</w:t>
+              <w:t>A1</w:t>
             </w:r>
           </w:p>
         </w:tc>
@@ -7190,7 +7190,7 @@
                 <w:i w:val="0"/>
                 <w:sz w:val="16"/>
               </w:rPr>
-              <w:t>—</w:t>
+              <w:t>A1</w:t>
             </w:r>
           </w:p>
         </w:tc>
@@ -7301,7 +7301,7 @@
                 <w:i w:val="0"/>
                 <w:sz w:val="16"/>
               </w:rPr>
-              <w:t>—</w:t>
+              <w:t>A1</w:t>
             </w:r>
           </w:p>
         </w:tc>
@@ -7412,7 +7412,7 @@
                 <w:i w:val="0"/>
                 <w:sz w:val="16"/>
               </w:rPr>
-              <w:t>—</w:t>
+              <w:t>A1</w:t>
             </w:r>
           </w:p>
         </w:tc>
@@ -7523,7 +7523,7 @@
                 <w:i w:val="0"/>
                 <w:sz w:val="16"/>
               </w:rPr>
-              <w:t>—</w:t>
+              <w:t>A1</w:t>
             </w:r>
           </w:p>
         </w:tc>
@@ -7634,7 +7634,7 @@
                 <w:i w:val="0"/>
                 <w:sz w:val="16"/>
               </w:rPr>
-              <w:t>—</w:t>
+              <w:t>A1</w:t>
             </w:r>
           </w:p>
         </w:tc>
@@ -7745,7 +7745,7 @@
                 <w:i w:val="0"/>
                 <w:sz w:val="16"/>
               </w:rPr>
-              <w:t>—</w:t>
+              <w:t>A1</w:t>
             </w:r>
           </w:p>
         </w:tc>
@@ -7856,7 +7856,7 @@
                 <w:i w:val="0"/>
                 <w:sz w:val="16"/>
               </w:rPr>
-              <w:t>—</w:t>
+              <w:t>A1</w:t>
             </w:r>
           </w:p>
         </w:tc>
@@ -7967,7 +7967,7 @@
                 <w:i w:val="0"/>
                 <w:sz w:val="16"/>
               </w:rPr>
-              <w:t>—</w:t>
+              <w:t>A1</w:t>
             </w:r>
           </w:p>
         </w:tc>
@@ -8017,7 +8017,7 @@
                 <w:color w:val="7B1E2B"/>
                 <w:sz w:val="15"/>
               </w:rPr>
-              <w:t>V.  DETALLES DE ARQUITECTURA  (37)</w:t>
+              <w:t>V.  DETALLES DE ARQUITECTURA  (38)</w:t>
             </w:r>
           </w:p>
         </w:tc>
@@ -10549,7 +10549,7 @@
                 <w:i w:val="0"/>
                 <w:sz w:val="16"/>
               </w:rPr>
-              <w:t>—</w:t>
+              <w:t>A1</w:t>
             </w:r>
           </w:p>
         </w:tc>
@@ -10660,7 +10660,7 @@
                 <w:i w:val="0"/>
                 <w:sz w:val="16"/>
               </w:rPr>
-              <w:t>—</w:t>
+              <w:t>A1</w:t>
             </w:r>
           </w:p>
         </w:tc>
@@ -10771,7 +10771,7 @@
                 <w:i w:val="0"/>
                 <w:sz w:val="16"/>
               </w:rPr>
-              <w:t>—</w:t>
+              <w:t>A1</w:t>
             </w:r>
           </w:p>
         </w:tc>
@@ -10882,7 +10882,7 @@
                 <w:i w:val="0"/>
                 <w:sz w:val="16"/>
               </w:rPr>
-              <w:t>—</w:t>
+              <w:t>A1</w:t>
             </w:r>
           </w:p>
         </w:tc>
@@ -10993,7 +10993,7 @@
                 <w:i w:val="0"/>
                 <w:sz w:val="16"/>
               </w:rPr>
-              <w:t>—</w:t>
+              <w:t>A1</w:t>
             </w:r>
           </w:p>
         </w:tc>
@@ -11104,7 +11104,7 @@
                 <w:i w:val="0"/>
                 <w:sz w:val="16"/>
               </w:rPr>
-              <w:t>—</w:t>
+              <w:t>A1</w:t>
             </w:r>
           </w:p>
         </w:tc>
@@ -11215,7 +11215,7 @@
                 <w:i w:val="0"/>
                 <w:sz w:val="16"/>
               </w:rPr>
-              <w:t>—</w:t>
+              <w:t>A1</w:t>
             </w:r>
           </w:p>
         </w:tc>
@@ -11326,7 +11326,7 @@
                 <w:i w:val="0"/>
                 <w:sz w:val="16"/>
               </w:rPr>
-              <w:t>—</w:t>
+              <w:t>A1</w:t>
             </w:r>
           </w:p>
         </w:tc>
@@ -11437,7 +11437,7 @@
                 <w:i w:val="0"/>
                 <w:sz w:val="16"/>
               </w:rPr>
-              <w:t>—</w:t>
+              <w:t>A1</w:t>
             </w:r>
           </w:p>
         </w:tc>
@@ -11548,7 +11548,7 @@
                 <w:i w:val="0"/>
                 <w:sz w:val="16"/>
               </w:rPr>
-              <w:t>—</w:t>
+              <w:t>A1</w:t>
             </w:r>
           </w:p>
         </w:tc>
@@ -11659,7 +11659,7 @@
                 <w:i w:val="0"/>
                 <w:sz w:val="16"/>
               </w:rPr>
-              <w:t>—</w:t>
+              <w:t>A1</w:t>
             </w:r>
           </w:p>
         </w:tc>
@@ -11770,7 +11770,7 @@
                 <w:i w:val="0"/>
                 <w:sz w:val="16"/>
               </w:rPr>
-              <w:t>—</w:t>
+              <w:t>A1</w:t>
             </w:r>
           </w:p>
         </w:tc>
@@ -11839,7 +11839,7 @@
                 <w:color w:val="7B1E2B"/>
                 <w:sz w:val="16"/>
               </w:rPr>
-              <w:t>DT-35/1-2</w:t>
+              <w:t>DT-35/1-3</w:t>
             </w:r>
           </w:p>
         </w:tc>
@@ -11881,7 +11881,7 @@
                 <w:i w:val="0"/>
                 <w:sz w:val="16"/>
               </w:rPr>
-              <w:t>—</w:t>
+              <w:t>A1</w:t>
             </w:r>
           </w:p>
         </w:tc>
@@ -11950,7 +11950,7 @@
                 <w:color w:val="7B1E2B"/>
                 <w:sz w:val="16"/>
               </w:rPr>
-              <w:t>DT-36/2-2</w:t>
+              <w:t>DT-36/2-3</w:t>
             </w:r>
           </w:p>
         </w:tc>
@@ -11992,7 +11992,7 @@
                 <w:i w:val="0"/>
                 <w:sz w:val="16"/>
               </w:rPr>
-              <w:t>—</w:t>
+              <w:t>A1</w:t>
             </w:r>
           </w:p>
         </w:tc>
@@ -12061,7 +12061,7 @@
                 <w:color w:val="7B1E2B"/>
                 <w:sz w:val="16"/>
               </w:rPr>
-              <w:t>DT-37/2-2</w:t>
+              <w:t>DT-37/3-3</w:t>
             </w:r>
           </w:p>
         </w:tc>
@@ -12082,7 +12082,7 @@
                 <w:i w:val="0"/>
                 <w:sz w:val="16"/>
               </w:rPr>
-              <w:t>PLANO DE DETALLE DE LUMINARIA EXTERIOR</w:t>
+              <w:t>PLANO DE DETALLE DE MESA DE TRABAJO</w:t>
             </w:r>
           </w:p>
         </w:tc>
@@ -12103,7 +12103,7 @@
                 <w:i w:val="0"/>
                 <w:sz w:val="16"/>
               </w:rPr>
-              <w:t>—</w:t>
+              <w:t>A1</w:t>
             </w:r>
           </w:p>
         </w:tc>
@@ -12135,9 +12135,50 @@
         </w:trPr>
         <w:tc>
           <w:tcPr>
-            <w:tcW w:type="dxa" w:w="9864"/>
-            <w:gridSpan w:val="5"/>
-            <w:shd w:val="clear" w:color="auto" w:fill="F2E6E8"/>
+            <w:tcW w:type="dxa" w:w="567"/>
+            <w:vAlign w:val="center"/>
+          </w:tcPr>
+          <w:p>
+            <w:pPr>
+              <w:spacing w:before="20" w:after="20" w:line="240" w:lineRule="auto"/>
+              <w:jc w:val="center"/>
+            </w:pPr>
+            <w:r>
+              <w:rPr>
+                <w:rFonts w:ascii="Arial" w:hAnsi="Arial" w:eastAsia="Arial"/>
+                <w:b w:val="0"/>
+                <w:i w:val="0"/>
+                <w:sz w:val="16"/>
+              </w:rPr>
+              <w:t>107</w:t>
+            </w:r>
+          </w:p>
+        </w:tc>
+        <w:tc>
+          <w:tcPr>
+            <w:tcW w:type="dxa" w:w="1474"/>
+            <w:vAlign w:val="center"/>
+          </w:tcPr>
+          <w:p>
+            <w:pPr>
+              <w:spacing w:before="20" w:after="20" w:line="240" w:lineRule="auto"/>
+              <w:jc w:val="center"/>
+            </w:pPr>
+            <w:r>
+              <w:rPr>
+                <w:rFonts w:ascii="Arial" w:hAnsi="Arial" w:eastAsia="Arial"/>
+                <w:b/>
+                <w:i w:val="0"/>
+                <w:color w:val="7B1E2B"/>
+                <w:sz w:val="16"/>
+              </w:rPr>
+              <w:t>DT-38/1</w:t>
+            </w:r>
+          </w:p>
+        </w:tc>
+        <w:tc>
+          <w:tcPr>
+            <w:tcW w:type="dxa" w:w="5953"/>
             <w:vAlign w:val="center"/>
           </w:tcPr>
           <w:p>
@@ -12150,10 +12191,51 @@
                 <w:rFonts w:ascii="Arial" w:hAnsi="Arial" w:eastAsia="Arial"/>
                 <w:b/>
                 <w:i w:val="0"/>
-                <w:color w:val="7B1E2B"/>
-                <w:sz w:val="15"/>
-              </w:rPr>
-              <w:t>VI.  EVACUACIÓN Y SEÑALIZACIÓN  (2)</w:t>
+                <w:sz w:val="16"/>
+              </w:rPr>
+              <w:t>PLANO DE DETALLE DE LUMINARIA EXTERIOR</w:t>
+            </w:r>
+          </w:p>
+        </w:tc>
+        <w:tc>
+          <w:tcPr>
+            <w:tcW w:type="dxa" w:w="1077"/>
+            <w:vAlign w:val="center"/>
+          </w:tcPr>
+          <w:p>
+            <w:pPr>
+              <w:spacing w:before="20" w:after="20" w:line="240" w:lineRule="auto"/>
+              <w:jc w:val="center"/>
+            </w:pPr>
+            <w:r>
+              <w:rPr>
+                <w:rFonts w:ascii="Arial" w:hAnsi="Arial" w:eastAsia="Arial"/>
+                <w:b w:val="0"/>
+                <w:i w:val="0"/>
+                <w:sz w:val="16"/>
+              </w:rPr>
+              <w:t>A1</w:t>
+            </w:r>
+          </w:p>
+        </w:tc>
+        <w:tc>
+          <w:tcPr>
+            <w:tcW w:type="dxa" w:w="794"/>
+            <w:vAlign w:val="center"/>
+          </w:tcPr>
+          <w:p>
+            <w:pPr>
+              <w:spacing w:before="20" w:after="20" w:line="240" w:lineRule="auto"/>
+              <w:jc w:val="center"/>
+            </w:pPr>
+            <w:r>
+              <w:rPr>
+                <w:rFonts w:ascii="Arial" w:hAnsi="Arial" w:eastAsia="Arial"/>
+                <w:b w:val="0"/>
+                <w:i w:val="0"/>
+                <w:sz w:val="16"/>
+              </w:rPr>
+              <w:t>1</w:t>
             </w:r>
           </w:p>
         </w:tc>
@@ -12164,34 +12246,15 @@
         </w:trPr>
         <w:tc>
           <w:tcPr>
-            <w:tcW w:type="dxa" w:w="567"/>
-            <w:vAlign w:val="center"/>
-          </w:tcPr>
-          <w:p>
-            <w:pPr>
-              <w:spacing w:before="20" w:after="20" w:line="240" w:lineRule="auto"/>
-              <w:jc w:val="center"/>
-            </w:pPr>
-            <w:r>
-              <w:rPr>
-                <w:rFonts w:ascii="Arial" w:hAnsi="Arial" w:eastAsia="Arial"/>
-                <w:b w:val="0"/>
-                <w:i w:val="0"/>
-                <w:sz w:val="16"/>
-              </w:rPr>
-              <w:t>107</w:t>
-            </w:r>
-          </w:p>
-        </w:tc>
-        <w:tc>
-          <w:tcPr>
-            <w:tcW w:type="dxa" w:w="1474"/>
-            <w:vAlign w:val="center"/>
-          </w:tcPr>
-          <w:p>
-            <w:pPr>
-              <w:spacing w:before="20" w:after="20" w:line="240" w:lineRule="auto"/>
-              <w:jc w:val="center"/>
+            <w:tcW w:type="dxa" w:w="9864"/>
+            <w:gridSpan w:val="5"/>
+            <w:shd w:val="clear" w:color="auto" w:fill="F2E6E8"/>
+            <w:vAlign w:val="center"/>
+          </w:tcPr>
+          <w:p>
+            <w:pPr>
+              <w:spacing w:before="20" w:after="20" w:line="240" w:lineRule="auto"/>
+              <w:jc w:val="left"/>
             </w:pPr>
             <w:r>
               <w:rPr>
@@ -12199,72 +12262,9 @@
                 <w:b/>
                 <w:i w:val="0"/>
                 <w:color w:val="7B1E2B"/>
-                <w:sz w:val="16"/>
-              </w:rPr>
-              <w:t>SE-S-01</w:t>
-            </w:r>
-          </w:p>
-        </w:tc>
-        <w:tc>
-          <w:tcPr>
-            <w:tcW w:type="dxa" w:w="5953"/>
-            <w:vAlign w:val="center"/>
-          </w:tcPr>
-          <w:p>
-            <w:pPr>
-              <w:spacing w:before="20" w:after="20" w:line="240" w:lineRule="auto"/>
-              <w:jc w:val="left"/>
-            </w:pPr>
-            <w:r>
-              <w:rPr>
-                <w:rFonts w:ascii="Arial" w:hAnsi="Arial" w:eastAsia="Arial"/>
-                <w:b/>
-                <w:i w:val="0"/>
-                <w:sz w:val="16"/>
-              </w:rPr>
-              <w:t>PLANTA GENERAL DE EVACUACIÓN</w:t>
-            </w:r>
-          </w:p>
-        </w:tc>
-        <w:tc>
-          <w:tcPr>
-            <w:tcW w:type="dxa" w:w="1077"/>
-            <w:vAlign w:val="center"/>
-          </w:tcPr>
-          <w:p>
-            <w:pPr>
-              <w:spacing w:before="20" w:after="20" w:line="240" w:lineRule="auto"/>
-              <w:jc w:val="center"/>
-            </w:pPr>
-            <w:r>
-              <w:rPr>
-                <w:rFonts w:ascii="Arial" w:hAnsi="Arial" w:eastAsia="Arial"/>
-                <w:b w:val="0"/>
-                <w:i w:val="0"/>
-                <w:sz w:val="16"/>
-              </w:rPr>
-              <w:t>—</w:t>
-            </w:r>
-          </w:p>
-        </w:tc>
-        <w:tc>
-          <w:tcPr>
-            <w:tcW w:type="dxa" w:w="794"/>
-            <w:vAlign w:val="center"/>
-          </w:tcPr>
-          <w:p>
-            <w:pPr>
-              <w:spacing w:before="20" w:after="20" w:line="240" w:lineRule="auto"/>
-              <w:jc w:val="center"/>
-            </w:pPr>
-            <w:r>
-              <w:rPr>
-                <w:rFonts w:ascii="Arial" w:hAnsi="Arial" w:eastAsia="Arial"/>
-                <w:b w:val="0"/>
-                <w:i w:val="0"/>
-                <w:sz w:val="16"/>
-              </w:rPr>
-              <w:t>1</w:t>
+                <w:sz w:val="15"/>
+              </w:rPr>
+              <w:t>VI.  EVACUACIÓN Y SEÑALIZACIÓN  (2)</w:t>
             </w:r>
           </w:p>
         </w:tc>
@@ -12312,7 +12312,7 @@
                 <w:color w:val="7B1E2B"/>
                 <w:sz w:val="16"/>
               </w:rPr>
-              <w:t>SE-E-02</w:t>
+              <w:t>SE-E-01</w:t>
             </w:r>
           </w:p>
         </w:tc>
@@ -12333,6 +12333,117 @@
                 <w:i w:val="0"/>
                 <w:sz w:val="16"/>
               </w:rPr>
+              <w:t>PLANTA GENERAL DE EVACUACIÓN</w:t>
+            </w:r>
+          </w:p>
+        </w:tc>
+        <w:tc>
+          <w:tcPr>
+            <w:tcW w:type="dxa" w:w="1077"/>
+            <w:vAlign w:val="center"/>
+          </w:tcPr>
+          <w:p>
+            <w:pPr>
+              <w:spacing w:before="20" w:after="20" w:line="240" w:lineRule="auto"/>
+              <w:jc w:val="center"/>
+            </w:pPr>
+            <w:r>
+              <w:rPr>
+                <w:rFonts w:ascii="Arial" w:hAnsi="Arial" w:eastAsia="Arial"/>
+                <w:b w:val="0"/>
+                <w:i w:val="0"/>
+                <w:sz w:val="16"/>
+              </w:rPr>
+              <w:t>A1</w:t>
+            </w:r>
+          </w:p>
+        </w:tc>
+        <w:tc>
+          <w:tcPr>
+            <w:tcW w:type="dxa" w:w="794"/>
+            <w:vAlign w:val="center"/>
+          </w:tcPr>
+          <w:p>
+            <w:pPr>
+              <w:spacing w:before="20" w:after="20" w:line="240" w:lineRule="auto"/>
+              <w:jc w:val="center"/>
+            </w:pPr>
+            <w:r>
+              <w:rPr>
+                <w:rFonts w:ascii="Arial" w:hAnsi="Arial" w:eastAsia="Arial"/>
+                <w:b w:val="0"/>
+                <w:i w:val="0"/>
+                <w:sz w:val="16"/>
+              </w:rPr>
+              <w:t>1</w:t>
+            </w:r>
+          </w:p>
+        </w:tc>
+      </w:tr>
+      <w:tr>
+        <w:trPr>
+          <w:cantSplit/>
+        </w:trPr>
+        <w:tc>
+          <w:tcPr>
+            <w:tcW w:type="dxa" w:w="567"/>
+            <w:vAlign w:val="center"/>
+          </w:tcPr>
+          <w:p>
+            <w:pPr>
+              <w:spacing w:before="20" w:after="20" w:line="240" w:lineRule="auto"/>
+              <w:jc w:val="center"/>
+            </w:pPr>
+            <w:r>
+              <w:rPr>
+                <w:rFonts w:ascii="Arial" w:hAnsi="Arial" w:eastAsia="Arial"/>
+                <w:b w:val="0"/>
+                <w:i w:val="0"/>
+                <w:sz w:val="16"/>
+              </w:rPr>
+              <w:t>109</w:t>
+            </w:r>
+          </w:p>
+        </w:tc>
+        <w:tc>
+          <w:tcPr>
+            <w:tcW w:type="dxa" w:w="1474"/>
+            <w:vAlign w:val="center"/>
+          </w:tcPr>
+          <w:p>
+            <w:pPr>
+              <w:spacing w:before="20" w:after="20" w:line="240" w:lineRule="auto"/>
+              <w:jc w:val="center"/>
+            </w:pPr>
+            <w:r>
+              <w:rPr>
+                <w:rFonts w:ascii="Arial" w:hAnsi="Arial" w:eastAsia="Arial"/>
+                <w:b/>
+                <w:i w:val="0"/>
+                <w:color w:val="7B1E2B"/>
+                <w:sz w:val="16"/>
+              </w:rPr>
+              <w:t>SE-S-02</w:t>
+            </w:r>
+          </w:p>
+        </w:tc>
+        <w:tc>
+          <w:tcPr>
+            <w:tcW w:type="dxa" w:w="5953"/>
+            <w:vAlign w:val="center"/>
+          </w:tcPr>
+          <w:p>
+            <w:pPr>
+              <w:spacing w:before="20" w:after="20" w:line="240" w:lineRule="auto"/>
+              <w:jc w:val="left"/>
+            </w:pPr>
+            <w:r>
+              <w:rPr>
+                <w:rFonts w:ascii="Arial" w:hAnsi="Arial" w:eastAsia="Arial"/>
+                <w:b/>
+                <w:i w:val="0"/>
+                <w:sz w:val="16"/>
+              </w:rPr>
               <w:t>PLANTA GENERAL DE SEÑALIZACIÓN</w:t>
             </w:r>
           </w:p>
@@ -12354,7 +12465,813 @@
                 <w:i w:val="0"/>
                 <w:sz w:val="16"/>
               </w:rPr>
-              <w:t>—</w:t>
+              <w:t>A1</w:t>
+            </w:r>
+          </w:p>
+        </w:tc>
+        <w:tc>
+          <w:tcPr>
+            <w:tcW w:type="dxa" w:w="794"/>
+            <w:vAlign w:val="center"/>
+          </w:tcPr>
+          <w:p>
+            <w:pPr>
+              <w:spacing w:before="20" w:after="20" w:line="240" w:lineRule="auto"/>
+              <w:jc w:val="center"/>
+            </w:pPr>
+            <w:r>
+              <w:rPr>
+                <w:rFonts w:ascii="Arial" w:hAnsi="Arial" w:eastAsia="Arial"/>
+                <w:b w:val="0"/>
+                <w:i w:val="0"/>
+                <w:sz w:val="16"/>
+              </w:rPr>
+              <w:t>1</w:t>
+            </w:r>
+          </w:p>
+        </w:tc>
+      </w:tr>
+      <w:tr>
+        <w:trPr>
+          <w:cantSplit/>
+        </w:trPr>
+        <w:tc>
+          <w:tcPr>
+            <w:tcW w:type="dxa" w:w="9864"/>
+            <w:gridSpan w:val="5"/>
+            <w:shd w:val="clear" w:color="auto" w:fill="F2E6E8"/>
+            <w:vAlign w:val="center"/>
+          </w:tcPr>
+          <w:p>
+            <w:pPr>
+              <w:spacing w:before="20" w:after="20" w:line="240" w:lineRule="auto"/>
+              <w:jc w:val="left"/>
+            </w:pPr>
+            <w:r>
+              <w:rPr>
+                <w:rFonts w:ascii="Arial" w:hAnsi="Arial" w:eastAsia="Arial"/>
+                <w:b/>
+                <w:i w:val="0"/>
+                <w:color w:val="7B1E2B"/>
+                <w:sz w:val="15"/>
+              </w:rPr>
+              <w:t>VII.  EQUIPAMIENTO Y MOBILIARIO  (7)</w:t>
+            </w:r>
+          </w:p>
+        </w:tc>
+      </w:tr>
+      <w:tr>
+        <w:trPr>
+          <w:cantSplit/>
+        </w:trPr>
+        <w:tc>
+          <w:tcPr>
+            <w:tcW w:type="dxa" w:w="567"/>
+            <w:vAlign w:val="center"/>
+          </w:tcPr>
+          <w:p>
+            <w:pPr>
+              <w:spacing w:before="20" w:after="20" w:line="240" w:lineRule="auto"/>
+              <w:jc w:val="center"/>
+            </w:pPr>
+            <w:r>
+              <w:rPr>
+                <w:rFonts w:ascii="Arial" w:hAnsi="Arial" w:eastAsia="Arial"/>
+                <w:b w:val="0"/>
+                <w:i w:val="0"/>
+                <w:sz w:val="16"/>
+              </w:rPr>
+              <w:t>110</w:t>
+            </w:r>
+          </w:p>
+        </w:tc>
+        <w:tc>
+          <w:tcPr>
+            <w:tcW w:type="dxa" w:w="1474"/>
+            <w:vAlign w:val="center"/>
+          </w:tcPr>
+          <w:p>
+            <w:pPr>
+              <w:spacing w:before="20" w:after="20" w:line="240" w:lineRule="auto"/>
+              <w:jc w:val="center"/>
+            </w:pPr>
+            <w:r>
+              <w:rPr>
+                <w:rFonts w:ascii="Arial" w:hAnsi="Arial" w:eastAsia="Arial"/>
+                <w:b/>
+                <w:i w:val="0"/>
+                <w:color w:val="7B1E2B"/>
+                <w:sz w:val="16"/>
+              </w:rPr>
+              <w:t>EM-01</w:t>
+            </w:r>
+          </w:p>
+        </w:tc>
+        <w:tc>
+          <w:tcPr>
+            <w:tcW w:type="dxa" w:w="5953"/>
+            <w:vAlign w:val="center"/>
+          </w:tcPr>
+          <w:p>
+            <w:pPr>
+              <w:spacing w:before="20" w:after="20" w:line="240" w:lineRule="auto"/>
+              <w:jc w:val="left"/>
+            </w:pPr>
+            <w:r>
+              <w:rPr>
+                <w:rFonts w:ascii="Arial" w:hAnsi="Arial" w:eastAsia="Arial"/>
+                <w:b/>
+                <w:i w:val="0"/>
+                <w:sz w:val="16"/>
+              </w:rPr>
+              <w:t>EQUIPAMIENTO Y MOBILIARIO EDIFICACIÓN 01</w:t>
+            </w:r>
+          </w:p>
+        </w:tc>
+        <w:tc>
+          <w:tcPr>
+            <w:tcW w:type="dxa" w:w="1077"/>
+            <w:vAlign w:val="center"/>
+          </w:tcPr>
+          <w:p>
+            <w:pPr>
+              <w:spacing w:before="20" w:after="20" w:line="240" w:lineRule="auto"/>
+              <w:jc w:val="center"/>
+            </w:pPr>
+            <w:r>
+              <w:rPr>
+                <w:rFonts w:ascii="Arial" w:hAnsi="Arial" w:eastAsia="Arial"/>
+                <w:b w:val="0"/>
+                <w:i w:val="0"/>
+                <w:sz w:val="16"/>
+              </w:rPr>
+              <w:t>A1</w:t>
+            </w:r>
+          </w:p>
+        </w:tc>
+        <w:tc>
+          <w:tcPr>
+            <w:tcW w:type="dxa" w:w="794"/>
+            <w:vAlign w:val="center"/>
+          </w:tcPr>
+          <w:p>
+            <w:pPr>
+              <w:spacing w:before="20" w:after="20" w:line="240" w:lineRule="auto"/>
+              <w:jc w:val="center"/>
+            </w:pPr>
+            <w:r>
+              <w:rPr>
+                <w:rFonts w:ascii="Arial" w:hAnsi="Arial" w:eastAsia="Arial"/>
+                <w:b w:val="0"/>
+                <w:i w:val="0"/>
+                <w:sz w:val="16"/>
+              </w:rPr>
+              <w:t>1</w:t>
+            </w:r>
+          </w:p>
+        </w:tc>
+      </w:tr>
+      <w:tr>
+        <w:trPr>
+          <w:cantSplit/>
+        </w:trPr>
+        <w:tc>
+          <w:tcPr>
+            <w:tcW w:type="dxa" w:w="567"/>
+            <w:vAlign w:val="center"/>
+          </w:tcPr>
+          <w:p>
+            <w:pPr>
+              <w:spacing w:before="20" w:after="20" w:line="240" w:lineRule="auto"/>
+              <w:jc w:val="center"/>
+            </w:pPr>
+            <w:r>
+              <w:rPr>
+                <w:rFonts w:ascii="Arial" w:hAnsi="Arial" w:eastAsia="Arial"/>
+                <w:b w:val="0"/>
+                <w:i w:val="0"/>
+                <w:sz w:val="16"/>
+              </w:rPr>
+              <w:t>111</w:t>
+            </w:r>
+          </w:p>
+        </w:tc>
+        <w:tc>
+          <w:tcPr>
+            <w:tcW w:type="dxa" w:w="1474"/>
+            <w:vAlign w:val="center"/>
+          </w:tcPr>
+          <w:p>
+            <w:pPr>
+              <w:spacing w:before="20" w:after="20" w:line="240" w:lineRule="auto"/>
+              <w:jc w:val="center"/>
+            </w:pPr>
+            <w:r>
+              <w:rPr>
+                <w:rFonts w:ascii="Arial" w:hAnsi="Arial" w:eastAsia="Arial"/>
+                <w:b/>
+                <w:i w:val="0"/>
+                <w:color w:val="7B1E2B"/>
+                <w:sz w:val="16"/>
+              </w:rPr>
+              <w:t>EM-02</w:t>
+            </w:r>
+          </w:p>
+        </w:tc>
+        <w:tc>
+          <w:tcPr>
+            <w:tcW w:type="dxa" w:w="5953"/>
+            <w:vAlign w:val="center"/>
+          </w:tcPr>
+          <w:p>
+            <w:pPr>
+              <w:spacing w:before="20" w:after="20" w:line="240" w:lineRule="auto"/>
+              <w:jc w:val="left"/>
+            </w:pPr>
+            <w:r>
+              <w:rPr>
+                <w:rFonts w:ascii="Arial" w:hAnsi="Arial" w:eastAsia="Arial"/>
+                <w:b/>
+                <w:i w:val="0"/>
+                <w:sz w:val="16"/>
+              </w:rPr>
+              <w:t>EQUIPAMIENTO Y MOBILIARIO EDIFICACIÓN 02 Y 03</w:t>
+            </w:r>
+          </w:p>
+        </w:tc>
+        <w:tc>
+          <w:tcPr>
+            <w:tcW w:type="dxa" w:w="1077"/>
+            <w:vAlign w:val="center"/>
+          </w:tcPr>
+          <w:p>
+            <w:pPr>
+              <w:spacing w:before="20" w:after="20" w:line="240" w:lineRule="auto"/>
+              <w:jc w:val="center"/>
+            </w:pPr>
+            <w:r>
+              <w:rPr>
+                <w:rFonts w:ascii="Arial" w:hAnsi="Arial" w:eastAsia="Arial"/>
+                <w:b w:val="0"/>
+                <w:i w:val="0"/>
+                <w:sz w:val="16"/>
+              </w:rPr>
+              <w:t>A1</w:t>
+            </w:r>
+          </w:p>
+        </w:tc>
+        <w:tc>
+          <w:tcPr>
+            <w:tcW w:type="dxa" w:w="794"/>
+            <w:vAlign w:val="center"/>
+          </w:tcPr>
+          <w:p>
+            <w:pPr>
+              <w:spacing w:before="20" w:after="20" w:line="240" w:lineRule="auto"/>
+              <w:jc w:val="center"/>
+            </w:pPr>
+            <w:r>
+              <w:rPr>
+                <w:rFonts w:ascii="Arial" w:hAnsi="Arial" w:eastAsia="Arial"/>
+                <w:b w:val="0"/>
+                <w:i w:val="0"/>
+                <w:sz w:val="16"/>
+              </w:rPr>
+              <w:t>1</w:t>
+            </w:r>
+          </w:p>
+        </w:tc>
+      </w:tr>
+      <w:tr>
+        <w:trPr>
+          <w:cantSplit/>
+        </w:trPr>
+        <w:tc>
+          <w:tcPr>
+            <w:tcW w:type="dxa" w:w="567"/>
+            <w:vAlign w:val="center"/>
+          </w:tcPr>
+          <w:p>
+            <w:pPr>
+              <w:spacing w:before="20" w:after="20" w:line="240" w:lineRule="auto"/>
+              <w:jc w:val="center"/>
+            </w:pPr>
+            <w:r>
+              <w:rPr>
+                <w:rFonts w:ascii="Arial" w:hAnsi="Arial" w:eastAsia="Arial"/>
+                <w:b w:val="0"/>
+                <w:i w:val="0"/>
+                <w:sz w:val="16"/>
+              </w:rPr>
+              <w:t>112</w:t>
+            </w:r>
+          </w:p>
+        </w:tc>
+        <w:tc>
+          <w:tcPr>
+            <w:tcW w:type="dxa" w:w="1474"/>
+            <w:vAlign w:val="center"/>
+          </w:tcPr>
+          <w:p>
+            <w:pPr>
+              <w:spacing w:before="20" w:after="20" w:line="240" w:lineRule="auto"/>
+              <w:jc w:val="center"/>
+            </w:pPr>
+            <w:r>
+              <w:rPr>
+                <w:rFonts w:ascii="Arial" w:hAnsi="Arial" w:eastAsia="Arial"/>
+                <w:b/>
+                <w:i w:val="0"/>
+                <w:color w:val="7B1E2B"/>
+                <w:sz w:val="16"/>
+              </w:rPr>
+              <w:t>EM-03</w:t>
+            </w:r>
+          </w:p>
+        </w:tc>
+        <w:tc>
+          <w:tcPr>
+            <w:tcW w:type="dxa" w:w="5953"/>
+            <w:vAlign w:val="center"/>
+          </w:tcPr>
+          <w:p>
+            <w:pPr>
+              <w:spacing w:before="20" w:after="20" w:line="240" w:lineRule="auto"/>
+              <w:jc w:val="left"/>
+            </w:pPr>
+            <w:r>
+              <w:rPr>
+                <w:rFonts w:ascii="Arial" w:hAnsi="Arial" w:eastAsia="Arial"/>
+                <w:b/>
+                <w:i w:val="0"/>
+                <w:sz w:val="16"/>
+              </w:rPr>
+              <w:t>EQUIPAMIENTO Y MOBILIARIO EDIFICACIÓN 04</w:t>
+            </w:r>
+          </w:p>
+        </w:tc>
+        <w:tc>
+          <w:tcPr>
+            <w:tcW w:type="dxa" w:w="1077"/>
+            <w:vAlign w:val="center"/>
+          </w:tcPr>
+          <w:p>
+            <w:pPr>
+              <w:spacing w:before="20" w:after="20" w:line="240" w:lineRule="auto"/>
+              <w:jc w:val="center"/>
+            </w:pPr>
+            <w:r>
+              <w:rPr>
+                <w:rFonts w:ascii="Arial" w:hAnsi="Arial" w:eastAsia="Arial"/>
+                <w:b w:val="0"/>
+                <w:i w:val="0"/>
+                <w:sz w:val="16"/>
+              </w:rPr>
+              <w:t>A1</w:t>
+            </w:r>
+          </w:p>
+        </w:tc>
+        <w:tc>
+          <w:tcPr>
+            <w:tcW w:type="dxa" w:w="794"/>
+            <w:vAlign w:val="center"/>
+          </w:tcPr>
+          <w:p>
+            <w:pPr>
+              <w:spacing w:before="20" w:after="20" w:line="240" w:lineRule="auto"/>
+              <w:jc w:val="center"/>
+            </w:pPr>
+            <w:r>
+              <w:rPr>
+                <w:rFonts w:ascii="Arial" w:hAnsi="Arial" w:eastAsia="Arial"/>
+                <w:b w:val="0"/>
+                <w:i w:val="0"/>
+                <w:sz w:val="16"/>
+              </w:rPr>
+              <w:t>1</w:t>
+            </w:r>
+          </w:p>
+        </w:tc>
+      </w:tr>
+      <w:tr>
+        <w:trPr>
+          <w:cantSplit/>
+        </w:trPr>
+        <w:tc>
+          <w:tcPr>
+            <w:tcW w:type="dxa" w:w="567"/>
+            <w:vAlign w:val="center"/>
+          </w:tcPr>
+          <w:p>
+            <w:pPr>
+              <w:spacing w:before="20" w:after="20" w:line="240" w:lineRule="auto"/>
+              <w:jc w:val="center"/>
+            </w:pPr>
+            <w:r>
+              <w:rPr>
+                <w:rFonts w:ascii="Arial" w:hAnsi="Arial" w:eastAsia="Arial"/>
+                <w:b w:val="0"/>
+                <w:i w:val="0"/>
+                <w:sz w:val="16"/>
+              </w:rPr>
+              <w:t>113</w:t>
+            </w:r>
+          </w:p>
+        </w:tc>
+        <w:tc>
+          <w:tcPr>
+            <w:tcW w:type="dxa" w:w="1474"/>
+            <w:vAlign w:val="center"/>
+          </w:tcPr>
+          <w:p>
+            <w:pPr>
+              <w:spacing w:before="20" w:after="20" w:line="240" w:lineRule="auto"/>
+              <w:jc w:val="center"/>
+            </w:pPr>
+            <w:r>
+              <w:rPr>
+                <w:rFonts w:ascii="Arial" w:hAnsi="Arial" w:eastAsia="Arial"/>
+                <w:b/>
+                <w:i w:val="0"/>
+                <w:color w:val="7B1E2B"/>
+                <w:sz w:val="16"/>
+              </w:rPr>
+              <w:t>EM-04</w:t>
+            </w:r>
+          </w:p>
+        </w:tc>
+        <w:tc>
+          <w:tcPr>
+            <w:tcW w:type="dxa" w:w="5953"/>
+            <w:vAlign w:val="center"/>
+          </w:tcPr>
+          <w:p>
+            <w:pPr>
+              <w:spacing w:before="20" w:after="20" w:line="240" w:lineRule="auto"/>
+              <w:jc w:val="left"/>
+            </w:pPr>
+            <w:r>
+              <w:rPr>
+                <w:rFonts w:ascii="Arial" w:hAnsi="Arial" w:eastAsia="Arial"/>
+                <w:b/>
+                <w:i w:val="0"/>
+                <w:sz w:val="16"/>
+              </w:rPr>
+              <w:t>EQUIPAMIENTO Y MOBILIARIO EDIFICACIÓN 05</w:t>
+            </w:r>
+          </w:p>
+        </w:tc>
+        <w:tc>
+          <w:tcPr>
+            <w:tcW w:type="dxa" w:w="1077"/>
+            <w:vAlign w:val="center"/>
+          </w:tcPr>
+          <w:p>
+            <w:pPr>
+              <w:spacing w:before="20" w:after="20" w:line="240" w:lineRule="auto"/>
+              <w:jc w:val="center"/>
+            </w:pPr>
+            <w:r>
+              <w:rPr>
+                <w:rFonts w:ascii="Arial" w:hAnsi="Arial" w:eastAsia="Arial"/>
+                <w:b w:val="0"/>
+                <w:i w:val="0"/>
+                <w:sz w:val="16"/>
+              </w:rPr>
+              <w:t>A1</w:t>
+            </w:r>
+          </w:p>
+        </w:tc>
+        <w:tc>
+          <w:tcPr>
+            <w:tcW w:type="dxa" w:w="794"/>
+            <w:vAlign w:val="center"/>
+          </w:tcPr>
+          <w:p>
+            <w:pPr>
+              <w:spacing w:before="20" w:after="20" w:line="240" w:lineRule="auto"/>
+              <w:jc w:val="center"/>
+            </w:pPr>
+            <w:r>
+              <w:rPr>
+                <w:rFonts w:ascii="Arial" w:hAnsi="Arial" w:eastAsia="Arial"/>
+                <w:b w:val="0"/>
+                <w:i w:val="0"/>
+                <w:sz w:val="16"/>
+              </w:rPr>
+              <w:t>1</w:t>
+            </w:r>
+          </w:p>
+        </w:tc>
+      </w:tr>
+      <w:tr>
+        <w:trPr>
+          <w:cantSplit/>
+        </w:trPr>
+        <w:tc>
+          <w:tcPr>
+            <w:tcW w:type="dxa" w:w="567"/>
+            <w:vAlign w:val="center"/>
+          </w:tcPr>
+          <w:p>
+            <w:pPr>
+              <w:spacing w:before="20" w:after="20" w:line="240" w:lineRule="auto"/>
+              <w:jc w:val="center"/>
+            </w:pPr>
+            <w:r>
+              <w:rPr>
+                <w:rFonts w:ascii="Arial" w:hAnsi="Arial" w:eastAsia="Arial"/>
+                <w:b w:val="0"/>
+                <w:i w:val="0"/>
+                <w:sz w:val="16"/>
+              </w:rPr>
+              <w:t>114</w:t>
+            </w:r>
+          </w:p>
+        </w:tc>
+        <w:tc>
+          <w:tcPr>
+            <w:tcW w:type="dxa" w:w="1474"/>
+            <w:vAlign w:val="center"/>
+          </w:tcPr>
+          <w:p>
+            <w:pPr>
+              <w:spacing w:before="20" w:after="20" w:line="240" w:lineRule="auto"/>
+              <w:jc w:val="center"/>
+            </w:pPr>
+            <w:r>
+              <w:rPr>
+                <w:rFonts w:ascii="Arial" w:hAnsi="Arial" w:eastAsia="Arial"/>
+                <w:b/>
+                <w:i w:val="0"/>
+                <w:color w:val="7B1E2B"/>
+                <w:sz w:val="16"/>
+              </w:rPr>
+              <w:t>EM-05</w:t>
+            </w:r>
+          </w:p>
+        </w:tc>
+        <w:tc>
+          <w:tcPr>
+            <w:tcW w:type="dxa" w:w="5953"/>
+            <w:vAlign w:val="center"/>
+          </w:tcPr>
+          <w:p>
+            <w:pPr>
+              <w:spacing w:before="20" w:after="20" w:line="240" w:lineRule="auto"/>
+              <w:jc w:val="left"/>
+            </w:pPr>
+            <w:r>
+              <w:rPr>
+                <w:rFonts w:ascii="Arial" w:hAnsi="Arial" w:eastAsia="Arial"/>
+                <w:b/>
+                <w:i w:val="0"/>
+                <w:sz w:val="16"/>
+              </w:rPr>
+              <w:t>EQUIPAMIENTO Y MOBILIARIO EDIFICACIÓN 06</w:t>
+            </w:r>
+          </w:p>
+        </w:tc>
+        <w:tc>
+          <w:tcPr>
+            <w:tcW w:type="dxa" w:w="1077"/>
+            <w:vAlign w:val="center"/>
+          </w:tcPr>
+          <w:p>
+            <w:pPr>
+              <w:spacing w:before="20" w:after="20" w:line="240" w:lineRule="auto"/>
+              <w:jc w:val="center"/>
+            </w:pPr>
+            <w:r>
+              <w:rPr>
+                <w:rFonts w:ascii="Arial" w:hAnsi="Arial" w:eastAsia="Arial"/>
+                <w:b w:val="0"/>
+                <w:i w:val="0"/>
+                <w:sz w:val="16"/>
+              </w:rPr>
+              <w:t>A1</w:t>
+            </w:r>
+          </w:p>
+        </w:tc>
+        <w:tc>
+          <w:tcPr>
+            <w:tcW w:type="dxa" w:w="794"/>
+            <w:vAlign w:val="center"/>
+          </w:tcPr>
+          <w:p>
+            <w:pPr>
+              <w:spacing w:before="20" w:after="20" w:line="240" w:lineRule="auto"/>
+              <w:jc w:val="center"/>
+            </w:pPr>
+            <w:r>
+              <w:rPr>
+                <w:rFonts w:ascii="Arial" w:hAnsi="Arial" w:eastAsia="Arial"/>
+                <w:b w:val="0"/>
+                <w:i w:val="0"/>
+                <w:sz w:val="16"/>
+              </w:rPr>
+              <w:t>1</w:t>
+            </w:r>
+          </w:p>
+        </w:tc>
+      </w:tr>
+      <w:tr>
+        <w:trPr>
+          <w:cantSplit/>
+        </w:trPr>
+        <w:tc>
+          <w:tcPr>
+            <w:tcW w:type="dxa" w:w="567"/>
+            <w:vAlign w:val="center"/>
+          </w:tcPr>
+          <w:p>
+            <w:pPr>
+              <w:spacing w:before="20" w:after="20" w:line="240" w:lineRule="auto"/>
+              <w:jc w:val="center"/>
+            </w:pPr>
+            <w:r>
+              <w:rPr>
+                <w:rFonts w:ascii="Arial" w:hAnsi="Arial" w:eastAsia="Arial"/>
+                <w:b w:val="0"/>
+                <w:i w:val="0"/>
+                <w:sz w:val="16"/>
+              </w:rPr>
+              <w:t>115</w:t>
+            </w:r>
+          </w:p>
+        </w:tc>
+        <w:tc>
+          <w:tcPr>
+            <w:tcW w:type="dxa" w:w="1474"/>
+            <w:vAlign w:val="center"/>
+          </w:tcPr>
+          <w:p>
+            <w:pPr>
+              <w:spacing w:before="20" w:after="20" w:line="240" w:lineRule="auto"/>
+              <w:jc w:val="center"/>
+            </w:pPr>
+            <w:r>
+              <w:rPr>
+                <w:rFonts w:ascii="Arial" w:hAnsi="Arial" w:eastAsia="Arial"/>
+                <w:b/>
+                <w:i w:val="0"/>
+                <w:color w:val="7B1E2B"/>
+                <w:sz w:val="16"/>
+              </w:rPr>
+              <w:t>EM-06</w:t>
+            </w:r>
+          </w:p>
+        </w:tc>
+        <w:tc>
+          <w:tcPr>
+            <w:tcW w:type="dxa" w:w="5953"/>
+            <w:vAlign w:val="center"/>
+          </w:tcPr>
+          <w:p>
+            <w:pPr>
+              <w:spacing w:before="20" w:after="20" w:line="240" w:lineRule="auto"/>
+              <w:jc w:val="left"/>
+            </w:pPr>
+            <w:r>
+              <w:rPr>
+                <w:rFonts w:ascii="Arial" w:hAnsi="Arial" w:eastAsia="Arial"/>
+                <w:b/>
+                <w:i w:val="0"/>
+                <w:sz w:val="16"/>
+              </w:rPr>
+              <w:t>EQUIPAMIENTO Y MOBILIARIO EDIFICACIÓN 07</w:t>
+            </w:r>
+          </w:p>
+        </w:tc>
+        <w:tc>
+          <w:tcPr>
+            <w:tcW w:type="dxa" w:w="1077"/>
+            <w:vAlign w:val="center"/>
+          </w:tcPr>
+          <w:p>
+            <w:pPr>
+              <w:spacing w:before="20" w:after="20" w:line="240" w:lineRule="auto"/>
+              <w:jc w:val="center"/>
+            </w:pPr>
+            <w:r>
+              <w:rPr>
+                <w:rFonts w:ascii="Arial" w:hAnsi="Arial" w:eastAsia="Arial"/>
+                <w:b w:val="0"/>
+                <w:i w:val="0"/>
+                <w:sz w:val="16"/>
+              </w:rPr>
+              <w:t>A1</w:t>
+            </w:r>
+          </w:p>
+        </w:tc>
+        <w:tc>
+          <w:tcPr>
+            <w:tcW w:type="dxa" w:w="794"/>
+            <w:vAlign w:val="center"/>
+          </w:tcPr>
+          <w:p>
+            <w:pPr>
+              <w:spacing w:before="20" w:after="20" w:line="240" w:lineRule="auto"/>
+              <w:jc w:val="center"/>
+            </w:pPr>
+            <w:r>
+              <w:rPr>
+                <w:rFonts w:ascii="Arial" w:hAnsi="Arial" w:eastAsia="Arial"/>
+                <w:b w:val="0"/>
+                <w:i w:val="0"/>
+                <w:sz w:val="16"/>
+              </w:rPr>
+              <w:t>1</w:t>
+            </w:r>
+          </w:p>
+        </w:tc>
+      </w:tr>
+      <w:tr>
+        <w:trPr>
+          <w:cantSplit/>
+        </w:trPr>
+        <w:tc>
+          <w:tcPr>
+            <w:tcW w:type="dxa" w:w="567"/>
+            <w:vAlign w:val="center"/>
+          </w:tcPr>
+          <w:p>
+            <w:pPr>
+              <w:spacing w:before="20" w:after="20" w:line="240" w:lineRule="auto"/>
+              <w:jc w:val="center"/>
+            </w:pPr>
+            <w:r>
+              <w:rPr>
+                <w:rFonts w:ascii="Arial" w:hAnsi="Arial" w:eastAsia="Arial"/>
+                <w:b w:val="0"/>
+                <w:i w:val="0"/>
+                <w:sz w:val="16"/>
+              </w:rPr>
+              <w:t>116</w:t>
+            </w:r>
+          </w:p>
+        </w:tc>
+        <w:tc>
+          <w:tcPr>
+            <w:tcW w:type="dxa" w:w="1474"/>
+            <w:vAlign w:val="center"/>
+          </w:tcPr>
+          <w:p>
+            <w:pPr>
+              <w:spacing w:before="20" w:after="20" w:line="240" w:lineRule="auto"/>
+              <w:jc w:val="center"/>
+            </w:pPr>
+            <w:r>
+              <w:rPr>
+                <w:rFonts w:ascii="Arial" w:hAnsi="Arial" w:eastAsia="Arial"/>
+                <w:b/>
+                <w:i w:val="0"/>
+                <w:color w:val="7B1E2B"/>
+                <w:sz w:val="16"/>
+              </w:rPr>
+              <w:t>EM-07</w:t>
+            </w:r>
+          </w:p>
+        </w:tc>
+        <w:tc>
+          <w:tcPr>
+            <w:tcW w:type="dxa" w:w="5953"/>
+            <w:vAlign w:val="center"/>
+          </w:tcPr>
+          <w:p>
+            <w:pPr>
+              <w:spacing w:before="20" w:after="20" w:line="240" w:lineRule="auto"/>
+              <w:jc w:val="left"/>
+            </w:pPr>
+            <w:r>
+              <w:rPr>
+                <w:rFonts w:ascii="Arial" w:hAnsi="Arial" w:eastAsia="Arial"/>
+                <w:b/>
+                <w:i w:val="0"/>
+                <w:sz w:val="16"/>
+              </w:rPr>
+              <w:t>EQUIPAMIENTO Y MOBILIARIO EDIFICACIÓN 08 Y 09</w:t>
+            </w:r>
+          </w:p>
+        </w:tc>
+        <w:tc>
+          <w:tcPr>
+            <w:tcW w:type="dxa" w:w="1077"/>
+            <w:vAlign w:val="center"/>
+          </w:tcPr>
+          <w:p>
+            <w:pPr>
+              <w:spacing w:before="20" w:after="20" w:line="240" w:lineRule="auto"/>
+              <w:jc w:val="center"/>
+            </w:pPr>
+            <w:r>
+              <w:rPr>
+                <w:rFonts w:ascii="Arial" w:hAnsi="Arial" w:eastAsia="Arial"/>
+                <w:b w:val="0"/>
+                <w:i w:val="0"/>
+                <w:sz w:val="16"/>
+              </w:rPr>
+              <w:t>A1</w:t>
             </w:r>
           </w:p>
         </w:tc>
@@ -12393,7 +13310,7 @@
           <w:i w:val="0"/>
           <w:sz w:val="18"/>
         </w:rPr>
-        <w:t>Total: 108 láminas (4 en A0, 59 en A1, 1 en A3, 44 sin formato indicado).</w:t>
+        <w:t>Total: 116 láminas (4 en A0, 111 en A1, 1 en A3).</w:t>
       </w:r>
     </w:p>
     <w:p>

</xml_diff>